<commit_message>
Remove Backlog section and update scope docs
Clean up README by removing the "Backlog (Epics)" section and the placeholder "Encontra em desenvolvimento...." line, leaving the scope links to the Wiki and scope documents. Update the scope documents (CornDrop_Documentacao_Escopo.docx and .pdf) in the doc.
</commit_message>
<xml_diff>
--- a/doc/CornDrop_Documentacao_Escopo.docx
+++ b/doc/CornDrop_Documentacao_Escopo.docx
@@ -2904,7 +2904,7 @@
         <w:pStyle w:val="ListParagraph"/>
         <w:numPr>
           <w:ilvl w:val="0"/>
-          <w:numId w:val="2"/>
+          <w:numId w:val="1"/>
         </w:numPr>
         <w:spacing w:before="40" w:after="40"/>
         <w:jc w:val="both"/>
@@ -2925,7 +2925,7 @@
         <w:pStyle w:val="ListParagraph"/>
         <w:numPr>
           <w:ilvl w:val="0"/>
-          <w:numId w:val="2"/>
+          <w:numId w:val="1"/>
         </w:numPr>
         <w:spacing w:before="40" w:after="40"/>
         <w:jc w:val="both"/>
@@ -2946,7 +2946,7 @@
         <w:pStyle w:val="ListParagraph"/>
         <w:numPr>
           <w:ilvl w:val="0"/>
-          <w:numId w:val="2"/>
+          <w:numId w:val="1"/>
         </w:numPr>
         <w:spacing w:before="40" w:after="40"/>
         <w:jc w:val="both"/>
@@ -2967,7 +2967,7 @@
         <w:pStyle w:val="ListParagraph"/>
         <w:numPr>
           <w:ilvl w:val="0"/>
-          <w:numId w:val="2"/>
+          <w:numId w:val="1"/>
         </w:numPr>
         <w:spacing w:before="40" w:after="40"/>
         <w:jc w:val="both"/>
@@ -2988,7 +2988,7 @@
         <w:pStyle w:val="ListParagraph"/>
         <w:numPr>
           <w:ilvl w:val="0"/>
-          <w:numId w:val="2"/>
+          <w:numId w:val="1"/>
         </w:numPr>
         <w:spacing w:before="40" w:after="40"/>
         <w:jc w:val="both"/>
@@ -3009,7 +3009,7 @@
         <w:pStyle w:val="ListParagraph"/>
         <w:numPr>
           <w:ilvl w:val="0"/>
-          <w:numId w:val="2"/>
+          <w:numId w:val="1"/>
         </w:numPr>
         <w:spacing w:before="40" w:after="40"/>
         <w:jc w:val="both"/>
@@ -3205,6 +3205,16 @@
                 <w:sz w:val="20"/>
                 <w:szCs w:val="20"/>
               </w:rPr>
+              <w:t>D</w:t>
+            </w:r>
+            <w:r>
+              <w:rPr>
+                <w:rFonts w:eastAsia="Arial" w:cs="Arial"/>
+                <w:color w:val="555555"/>
+                <w:sz w:val="20"/>
+                <w:szCs w:val="20"/>
+              </w:rPr>
+              <w:t xml:space="preserve">esenvolvimento da tela principal de monitoramento do sistema, permitindo a visualização consolidada de indicadores operacionais, status dos dispositivos, consumo semanal, nível do reservatório. O módulo tem como objetivo fornecer uma visão rápida e estratégica da operação em tempo real. </w:t>
             </w:r>
           </w:p>
         </w:tc>
@@ -3238,6 +3248,16 @@
                 <w:sz w:val="20"/>
                 <w:szCs w:val="20"/>
               </w:rPr>
+              <w:t>EP-0</w:t>
+            </w:r>
+            <w:r>
+              <w:rPr>
+                <w:rFonts w:eastAsia="Arial" w:cs="Arial"/>
+                <w:color w:val="555555"/>
+                <w:sz w:val="20"/>
+                <w:szCs w:val="20"/>
+              </w:rPr>
+              <w:t>2</w:t>
             </w:r>
           </w:p>
         </w:tc>
@@ -3268,6 +3288,7 @@
                 <w:sz w:val="20"/>
                 <w:szCs w:val="20"/>
               </w:rPr>
+              <w:t xml:space="preserve">Contempla o desenvolvimento das funcionalidades de gerenciamento dos dispositivos IoT vinculados ao sistema, incluindo cadastro, visualização de status e acesso aos detalhes individuais de cada dispositivo, garantindo controle operacional e rastreabilidade da infraestrutura. </w:t>
             </w:r>
           </w:p>
         </w:tc>
@@ -3303,6 +3324,16 @@
                 <w:sz w:val="20"/>
                 <w:szCs w:val="20"/>
               </w:rPr>
+              <w:t>EP-0</w:t>
+            </w:r>
+            <w:r>
+              <w:rPr>
+                <w:rFonts w:eastAsia="Arial" w:cs="Arial"/>
+                <w:color w:val="555555"/>
+                <w:sz w:val="20"/>
+                <w:szCs w:val="20"/>
+              </w:rPr>
+              <w:t>3</w:t>
             </w:r>
           </w:p>
         </w:tc>
@@ -3333,6 +3364,16 @@
                 <w:sz w:val="20"/>
                 <w:szCs w:val="20"/>
               </w:rPr>
+              <w:t>Implementação</w:t>
+            </w:r>
+            <w:r>
+              <w:rPr>
+                <w:rFonts w:eastAsia="Arial" w:cs="Arial"/>
+                <w:color w:val="555555"/>
+                <w:sz w:val="20"/>
+                <w:szCs w:val="20"/>
+              </w:rPr>
+              <w:t xml:space="preserve"> do módulo de controle de estoque, permitindo acompanhar níveis de insumos, registros de entrada e histórico de movimentações. O objetivo é fornecer suporte ao gerenciamento eficiente do abastecimento operacional. </w:t>
             </w:r>
           </w:p>
         </w:tc>
@@ -3366,6 +3407,16 @@
                 <w:sz w:val="20"/>
                 <w:szCs w:val="20"/>
               </w:rPr>
+              <w:t>EP-0</w:t>
+            </w:r>
+            <w:r>
+              <w:rPr>
+                <w:rFonts w:eastAsia="Arial" w:cs="Arial"/>
+                <w:color w:val="555555"/>
+                <w:sz w:val="20"/>
+                <w:szCs w:val="20"/>
+              </w:rPr>
+              <w:t>4</w:t>
             </w:r>
           </w:p>
         </w:tc>
@@ -3396,6 +3447,97 @@
                 <w:sz w:val="20"/>
                 <w:szCs w:val="20"/>
               </w:rPr>
+              <w:t xml:space="preserve">Contempla o desenvolvimento das funcionalidades de criação, edição e gerenciamento de rotinas automáticas de alimentação, incluindo configuração de horários, frequência, dispositivos vinculados e monitoramento do consumo projetado. O módulo busca automatizar e otimizar a operação diária do sistema. </w:t>
+            </w:r>
+          </w:p>
+        </w:tc>
+      </w:tr>
+      <w:tr>
+        <w:trPr/>
+        <w:tc>
+          <w:tcPr>
+            <w:tcW w:w="1710" w:type="dxa"/>
+            <w:tcBorders>
+              <w:start w:val="single" w:sz="2" w:space="0" w:color="CCCCCC"/>
+              <w:bottom w:val="single" w:sz="2" w:space="0" w:color="CCCCCC"/>
+              <w:end w:val="single" w:sz="2" w:space="0" w:color="CCCCCC"/>
+            </w:tcBorders>
+          </w:tcPr>
+          <w:p>
+            <w:pPr>
+              <w:pStyle w:val="Normal"/>
+              <w:rPr>
+                <w:rFonts w:ascii="Arial" w:hAnsi="Arial" w:eastAsia="Arial" w:cs="Arial"/>
+                <w:color w:val="555555"/>
+                <w:sz w:val="20"/>
+                <w:szCs w:val="20"/>
+              </w:rPr>
+            </w:pPr>
+            <w:r>
+              <w:rPr>
+                <w:rFonts w:eastAsia="Arial" w:cs="Arial"/>
+                <w:color w:val="555555"/>
+                <w:sz w:val="20"/>
+                <w:szCs w:val="20"/>
+              </w:rPr>
+              <w:t>EP-0</w:t>
+            </w:r>
+            <w:r>
+              <w:rPr>
+                <w:rFonts w:eastAsia="Arial" w:cs="Arial"/>
+                <w:color w:val="555555"/>
+                <w:sz w:val="20"/>
+                <w:szCs w:val="20"/>
+              </w:rPr>
+              <w:t>5</w:t>
+            </w:r>
+          </w:p>
+        </w:tc>
+        <w:tc>
+          <w:tcPr>
+            <w:tcW w:w="7650" w:type="dxa"/>
+            <w:tcBorders>
+              <w:start w:val="single" w:sz="2" w:space="0" w:color="CCCCCC"/>
+              <w:bottom w:val="single" w:sz="2" w:space="0" w:color="CCCCCC"/>
+              <w:end w:val="single" w:sz="2" w:space="0" w:color="CCCCCC"/>
+            </w:tcBorders>
+          </w:tcPr>
+          <w:p>
+            <w:pPr>
+              <w:pStyle w:val="Normal"/>
+              <w:rPr>
+                <w:rFonts w:ascii="Arial" w:hAnsi="Arial" w:eastAsia="Arial" w:cs="Arial"/>
+                <w:color w:val="555555"/>
+                <w:sz w:val="20"/>
+                <w:szCs w:val="20"/>
+              </w:rPr>
+            </w:pPr>
+            <w:r>
+              <w:rPr>
+                <w:rFonts w:eastAsia="Arial" w:cs="Arial"/>
+                <w:color w:val="555555"/>
+                <w:sz w:val="20"/>
+                <w:szCs w:val="20"/>
+              </w:rPr>
+              <w:t xml:space="preserve">Responsável pela implementação </w:t>
+            </w:r>
+            <w:r>
+              <w:rPr>
+                <w:rFonts w:eastAsia="Arial" w:cs="Arial"/>
+                <w:color w:val="555555"/>
+                <w:sz w:val="20"/>
+                <w:szCs w:val="20"/>
+              </w:rPr>
+              <w:t xml:space="preserve">da </w:t>
+            </w:r>
+            <w:r>
+              <w:rPr>
+                <w:rFonts w:eastAsia="Arial" w:cs="Arial"/>
+                <w:color w:val="555555"/>
+                <w:sz w:val="20"/>
+                <w:szCs w:val="20"/>
+              </w:rPr>
+              <w:t xml:space="preserve">estrutura visual compartilhada entre as telas do sistema, incluindo navbar desktop. O objetivo é garantir consistência visual, acessibilidade e fluidez na experiência do usuário em diferentes dispositivos. </w:t>
             </w:r>
           </w:p>
         </w:tc>
@@ -3405,6 +3547,53 @@
       <w:pPr>
         <w:pStyle w:val="Normal"/>
         <w:spacing w:before="200" w:after="0"/>
+        <w:rPr/>
+      </w:pPr>
+      <w:r>
+        <w:rPr/>
+      </w:r>
+    </w:p>
+    <w:p>
+      <w:pPr>
+        <w:pStyle w:val="Heading1"/>
+        <w:pBdr>
+          <w:bottom w:val="single" w:sz="6" w:space="4" w:color="2E7D32"/>
+        </w:pBdr>
+        <w:spacing w:before="360" w:after="120"/>
+        <w:rPr/>
+      </w:pPr>
+      <w:r>
+        <w:rPr>
+          <w:rFonts w:eastAsia="Arial" w:cs="Arial"/>
+          <w:b/>
+          <w:bCs/>
+          <w:color w:val="2E7D32"/>
+          <w:sz w:val="30"/>
+          <w:szCs w:val="30"/>
+        </w:rPr>
+        <w:t>10. Estrutura da Documentação Inicial</w:t>
+      </w:r>
+    </w:p>
+    <w:p>
+      <w:pPr>
+        <w:pStyle w:val="Normal"/>
+        <w:spacing w:before="60" w:after="80"/>
+        <w:rPr/>
+      </w:pPr>
+      <w:r>
+        <w:rPr>
+          <w:rFonts w:eastAsia="Arial" w:cs="Arial"/>
+          <w:color w:val="555555"/>
+          <w:sz w:val="22"/>
+          <w:szCs w:val="22"/>
+        </w:rPr>
+        <w:t>A documentação completa do projeto esta distribuída conforme abaixo:</w:t>
+      </w:r>
+    </w:p>
+    <w:p>
+      <w:pPr>
+        <w:pStyle w:val="Normal"/>
+        <w:spacing w:before="80" w:after="0"/>
         <w:rPr/>
       </w:pPr>
       <w:r>
@@ -3425,19 +3614,19 @@
         </w:tblCellMar>
       </w:tblPr>
       <w:tblGrid>
-        <w:gridCol w:w="882"/>
-        <w:gridCol w:w="884"/>
-        <w:gridCol w:w="7594"/>
+        <w:gridCol w:w="3497"/>
+        <w:gridCol w:w="5863"/>
       </w:tblGrid>
       <w:tr>
         <w:trPr/>
         <w:tc>
           <w:tcPr>
-            <w:tcW w:w="882" w:type="dxa"/>
-            <w:tcBorders>
-              <w:top w:val="single" w:sz="2" w:space="0" w:color="CCCCCC"/>
-              <w:start w:val="single" w:sz="2" w:space="0" w:color="CCCCCC"/>
-              <w:bottom w:val="single" w:sz="2" w:space="0" w:color="CCCCCC"/>
+            <w:tcW w:w="3497" w:type="dxa"/>
+            <w:tcBorders>
+              <w:top w:val="single" w:sz="2" w:space="0" w:color="CCCCCC"/>
+              <w:start w:val="single" w:sz="2" w:space="0" w:color="CCCCCC"/>
+              <w:bottom w:val="single" w:sz="2" w:space="0" w:color="CCCCCC"/>
+              <w:end w:val="single" w:sz="2" w:space="0" w:color="CCCCCC"/>
             </w:tcBorders>
             <w:shd w:fill="C8E6C9" w:val="clear"/>
           </w:tcPr>
@@ -3455,13 +3644,13 @@
                 <w:sz w:val="20"/>
                 <w:szCs w:val="20"/>
               </w:rPr>
-              <w:t>Epic</w:t>
-            </w:r>
-          </w:p>
-        </w:tc>
-        <w:tc>
-          <w:tcPr>
-            <w:tcW w:w="884" w:type="dxa"/>
+              <w:t>Documento</w:t>
+            </w:r>
+          </w:p>
+        </w:tc>
+        <w:tc>
+          <w:tcPr>
+            <w:tcW w:w="5863" w:type="dxa"/>
             <w:tcBorders>
               <w:top w:val="single" w:sz="2" w:space="0" w:color="CCCCCC"/>
               <w:start w:val="single" w:sz="2" w:space="0" w:color="CCCCCC"/>
@@ -3484,36 +3673,7 @@
                 <w:sz w:val="20"/>
                 <w:szCs w:val="20"/>
               </w:rPr>
-              <w:t>HU</w:t>
-            </w:r>
-          </w:p>
-        </w:tc>
-        <w:tc>
-          <w:tcPr>
-            <w:tcW w:w="7594" w:type="dxa"/>
-            <w:tcBorders>
-              <w:top w:val="single" w:sz="2" w:space="0" w:color="CCCCCC"/>
-              <w:start w:val="single" w:sz="2" w:space="0" w:color="CCCCCC"/>
-              <w:bottom w:val="single" w:sz="2" w:space="0" w:color="CCCCCC"/>
-              <w:end w:val="single" w:sz="2" w:space="0" w:color="CCCCCC"/>
-            </w:tcBorders>
-            <w:shd w:fill="C8E6C9" w:val="clear"/>
-          </w:tcPr>
-          <w:p>
-            <w:pPr>
-              <w:pStyle w:val="Normal"/>
-              <w:rPr/>
-            </w:pPr>
-            <w:r>
-              <w:rPr>
-                <w:rFonts w:eastAsia="Arial" w:cs="Arial"/>
-                <w:b/>
-                <w:bCs/>
-                <w:color w:val="2E7D32"/>
-                <w:sz w:val="20"/>
-                <w:szCs w:val="20"/>
-              </w:rPr>
-              <w:t>Descrição</w:t>
+              <w:t>Localização</w:t>
             </w:r>
           </w:p>
         </w:tc>
@@ -3522,469 +3682,7 @@
         <w:trPr/>
         <w:tc>
           <w:tcPr>
-            <w:tcW w:w="882" w:type="dxa"/>
-            <w:tcBorders>
-              <w:top w:val="single" w:sz="2" w:space="0" w:color="CCCCCC"/>
-              <w:start w:val="single" w:sz="2" w:space="0" w:color="CCCCCC"/>
-              <w:bottom w:val="single" w:sz="2" w:space="0" w:color="CCCCCC"/>
-            </w:tcBorders>
-          </w:tcPr>
-          <w:p>
-            <w:pPr>
-              <w:pStyle w:val="Normal"/>
-              <w:rPr/>
-            </w:pPr>
-            <w:r>
-              <w:rPr>
-                <w:rFonts w:eastAsia="Arial" w:cs="Arial"/>
-                <w:color w:val="555555"/>
-                <w:sz w:val="20"/>
-                <w:szCs w:val="20"/>
-              </w:rPr>
-              <w:t>EP-01</w:t>
-            </w:r>
-          </w:p>
-        </w:tc>
-        <w:tc>
-          <w:tcPr>
-            <w:tcW w:w="884" w:type="dxa"/>
-            <w:tcBorders>
-              <w:top w:val="single" w:sz="2" w:space="0" w:color="CCCCCC"/>
-              <w:start w:val="single" w:sz="2" w:space="0" w:color="CCCCCC"/>
-              <w:bottom w:val="single" w:sz="2" w:space="0" w:color="CCCCCC"/>
-              <w:end w:val="single" w:sz="2" w:space="0" w:color="CCCCCC"/>
-            </w:tcBorders>
-          </w:tcPr>
-          <w:p>
-            <w:pPr>
-              <w:pStyle w:val="Normal"/>
-              <w:rPr/>
-            </w:pPr>
-            <w:r>
-              <w:rPr/>
-            </w:r>
-          </w:p>
-        </w:tc>
-        <w:tc>
-          <w:tcPr>
-            <w:tcW w:w="7594" w:type="dxa"/>
-            <w:tcBorders>
-              <w:top w:val="single" w:sz="2" w:space="0" w:color="CCCCCC"/>
-              <w:start w:val="single" w:sz="2" w:space="0" w:color="CCCCCC"/>
-              <w:bottom w:val="single" w:sz="2" w:space="0" w:color="CCCCCC"/>
-              <w:end w:val="single" w:sz="2" w:space="0" w:color="CCCCCC"/>
-            </w:tcBorders>
-          </w:tcPr>
-          <w:p>
-            <w:pPr>
-              <w:pStyle w:val="Normal"/>
-              <w:rPr>
-                <w:rFonts w:ascii="Arial" w:hAnsi="Arial" w:eastAsia="Arial" w:cs="Arial"/>
-                <w:color w:val="555555"/>
-                <w:sz w:val="20"/>
-                <w:szCs w:val="20"/>
-              </w:rPr>
-            </w:pPr>
-            <w:r>
-              <w:rPr>
-                <w:rFonts w:eastAsia="Arial" w:cs="Arial"/>
-                <w:color w:val="555555"/>
-                <w:sz w:val="20"/>
-                <w:szCs w:val="20"/>
-              </w:rPr>
-            </w:r>
-          </w:p>
-        </w:tc>
-      </w:tr>
-      <w:tr>
-        <w:trPr/>
-        <w:tc>
-          <w:tcPr>
-            <w:tcW w:w="882" w:type="dxa"/>
-            <w:tcBorders>
-              <w:top w:val="single" w:sz="2" w:space="0" w:color="CCCCCC"/>
-              <w:start w:val="single" w:sz="2" w:space="0" w:color="CCCCCC"/>
-              <w:bottom w:val="single" w:sz="2" w:space="0" w:color="CCCCCC"/>
-            </w:tcBorders>
-          </w:tcPr>
-          <w:p>
-            <w:pPr>
-              <w:pStyle w:val="Normal"/>
-              <w:rPr>
-                <w:rFonts w:ascii="Arial" w:hAnsi="Arial" w:eastAsia="Arial" w:cs="Arial"/>
-                <w:color w:val="555555"/>
-                <w:sz w:val="20"/>
-                <w:szCs w:val="20"/>
-              </w:rPr>
-            </w:pPr>
-            <w:r>
-              <w:rPr>
-                <w:rFonts w:eastAsia="Arial" w:cs="Arial"/>
-                <w:color w:val="555555"/>
-                <w:sz w:val="20"/>
-                <w:szCs w:val="20"/>
-              </w:rPr>
-            </w:r>
-          </w:p>
-        </w:tc>
-        <w:tc>
-          <w:tcPr>
-            <w:tcW w:w="884" w:type="dxa"/>
-            <w:tcBorders>
-              <w:top w:val="single" w:sz="2" w:space="0" w:color="CCCCCC"/>
-              <w:start w:val="single" w:sz="2" w:space="0" w:color="CCCCCC"/>
-              <w:bottom w:val="single" w:sz="2" w:space="0" w:color="CCCCCC"/>
-              <w:end w:val="single" w:sz="2" w:space="0" w:color="CCCCCC"/>
-            </w:tcBorders>
-          </w:tcPr>
-          <w:p>
-            <w:pPr>
-              <w:pStyle w:val="Normal"/>
-              <w:rPr/>
-            </w:pPr>
-            <w:r>
-              <w:rPr/>
-            </w:r>
-          </w:p>
-        </w:tc>
-        <w:tc>
-          <w:tcPr>
-            <w:tcW w:w="7594" w:type="dxa"/>
-            <w:tcBorders>
-              <w:top w:val="single" w:sz="2" w:space="0" w:color="CCCCCC"/>
-              <w:start w:val="single" w:sz="2" w:space="0" w:color="CCCCCC"/>
-              <w:bottom w:val="single" w:sz="2" w:space="0" w:color="CCCCCC"/>
-              <w:end w:val="single" w:sz="2" w:space="0" w:color="CCCCCC"/>
-            </w:tcBorders>
-          </w:tcPr>
-          <w:p>
-            <w:pPr>
-              <w:pStyle w:val="Normal"/>
-              <w:rPr>
-                <w:rFonts w:ascii="Arial" w:hAnsi="Arial" w:eastAsia="Arial" w:cs="Arial"/>
-                <w:color w:val="555555"/>
-                <w:sz w:val="20"/>
-                <w:szCs w:val="20"/>
-              </w:rPr>
-            </w:pPr>
-            <w:r>
-              <w:rPr>
-                <w:rFonts w:eastAsia="Arial" w:cs="Arial"/>
-                <w:color w:val="555555"/>
-                <w:sz w:val="20"/>
-                <w:szCs w:val="20"/>
-              </w:rPr>
-            </w:r>
-          </w:p>
-        </w:tc>
-      </w:tr>
-      <w:tr>
-        <w:trPr>
-          <w:trHeight w:val="84" w:hRule="atLeast"/>
-        </w:trPr>
-        <w:tc>
-          <w:tcPr>
-            <w:tcW w:w="882" w:type="dxa"/>
-            <w:tcBorders>
-              <w:top w:val="single" w:sz="2" w:space="0" w:color="CCCCCC"/>
-              <w:start w:val="single" w:sz="2" w:space="0" w:color="CCCCCC"/>
-              <w:bottom w:val="single" w:sz="2" w:space="0" w:color="CCCCCC"/>
-            </w:tcBorders>
-          </w:tcPr>
-          <w:p>
-            <w:pPr>
-              <w:pStyle w:val="Normal"/>
-              <w:rPr>
-                <w:rFonts w:ascii="Arial" w:hAnsi="Arial" w:eastAsia="Arial" w:cs="Arial"/>
-                <w:color w:val="555555"/>
-                <w:sz w:val="20"/>
-                <w:szCs w:val="20"/>
-              </w:rPr>
-            </w:pPr>
-            <w:r>
-              <w:rPr>
-                <w:rFonts w:eastAsia="Arial" w:cs="Arial"/>
-                <w:color w:val="555555"/>
-                <w:sz w:val="20"/>
-                <w:szCs w:val="20"/>
-              </w:rPr>
-            </w:r>
-          </w:p>
-        </w:tc>
-        <w:tc>
-          <w:tcPr>
-            <w:tcW w:w="884" w:type="dxa"/>
-            <w:tcBorders>
-              <w:top w:val="single" w:sz="2" w:space="0" w:color="CCCCCC"/>
-              <w:start w:val="single" w:sz="2" w:space="0" w:color="CCCCCC"/>
-              <w:bottom w:val="single" w:sz="2" w:space="0" w:color="CCCCCC"/>
-              <w:end w:val="single" w:sz="2" w:space="0" w:color="CCCCCC"/>
-            </w:tcBorders>
-          </w:tcPr>
-          <w:p>
-            <w:pPr>
-              <w:pStyle w:val="Normal"/>
-              <w:rPr/>
-            </w:pPr>
-            <w:r>
-              <w:rPr/>
-            </w:r>
-          </w:p>
-        </w:tc>
-        <w:tc>
-          <w:tcPr>
-            <w:tcW w:w="7594" w:type="dxa"/>
-            <w:tcBorders>
-              <w:top w:val="single" w:sz="2" w:space="0" w:color="CCCCCC"/>
-              <w:start w:val="single" w:sz="2" w:space="0" w:color="CCCCCC"/>
-              <w:bottom w:val="single" w:sz="2" w:space="0" w:color="CCCCCC"/>
-              <w:end w:val="single" w:sz="2" w:space="0" w:color="CCCCCC"/>
-            </w:tcBorders>
-          </w:tcPr>
-          <w:p>
-            <w:pPr>
-              <w:pStyle w:val="Normal"/>
-              <w:rPr>
-                <w:rFonts w:ascii="Arial" w:hAnsi="Arial" w:eastAsia="Arial" w:cs="Arial"/>
-                <w:color w:val="555555"/>
-                <w:sz w:val="20"/>
-                <w:szCs w:val="20"/>
-              </w:rPr>
-            </w:pPr>
-            <w:r>
-              <w:rPr>
-                <w:rFonts w:eastAsia="Arial" w:cs="Arial"/>
-                <w:color w:val="555555"/>
-                <w:sz w:val="20"/>
-                <w:szCs w:val="20"/>
-              </w:rPr>
-            </w:r>
-          </w:p>
-        </w:tc>
-      </w:tr>
-      <w:tr>
-        <w:trPr/>
-        <w:tc>
-          <w:tcPr>
-            <w:tcW w:w="882" w:type="dxa"/>
-            <w:tcBorders>
-              <w:top w:val="single" w:sz="2" w:space="0" w:color="CCCCCC"/>
-              <w:start w:val="single" w:sz="2" w:space="0" w:color="CCCCCC"/>
-              <w:bottom w:val="single" w:sz="2" w:space="0" w:color="CCCCCC"/>
-            </w:tcBorders>
-          </w:tcPr>
-          <w:p>
-            <w:pPr>
-              <w:pStyle w:val="Normal"/>
-              <w:rPr>
-                <w:rFonts w:ascii="Arial" w:hAnsi="Arial" w:eastAsia="Arial" w:cs="Arial"/>
-                <w:color w:val="555555"/>
-                <w:sz w:val="20"/>
-                <w:szCs w:val="20"/>
-              </w:rPr>
-            </w:pPr>
-            <w:r>
-              <w:rPr>
-                <w:rFonts w:eastAsia="Arial" w:cs="Arial"/>
-                <w:color w:val="555555"/>
-                <w:sz w:val="20"/>
-                <w:szCs w:val="20"/>
-              </w:rPr>
-            </w:r>
-          </w:p>
-        </w:tc>
-        <w:tc>
-          <w:tcPr>
-            <w:tcW w:w="884" w:type="dxa"/>
-            <w:tcBorders>
-              <w:top w:val="single" w:sz="2" w:space="0" w:color="CCCCCC"/>
-              <w:start w:val="single" w:sz="2" w:space="0" w:color="CCCCCC"/>
-              <w:bottom w:val="single" w:sz="2" w:space="0" w:color="CCCCCC"/>
-              <w:end w:val="single" w:sz="2" w:space="0" w:color="CCCCCC"/>
-            </w:tcBorders>
-          </w:tcPr>
-          <w:p>
-            <w:pPr>
-              <w:pStyle w:val="Normal"/>
-              <w:rPr/>
-            </w:pPr>
-            <w:r>
-              <w:rPr/>
-            </w:r>
-          </w:p>
-        </w:tc>
-        <w:tc>
-          <w:tcPr>
-            <w:tcW w:w="7594" w:type="dxa"/>
-            <w:tcBorders>
-              <w:top w:val="single" w:sz="2" w:space="0" w:color="CCCCCC"/>
-              <w:start w:val="single" w:sz="2" w:space="0" w:color="CCCCCC"/>
-              <w:bottom w:val="single" w:sz="2" w:space="0" w:color="CCCCCC"/>
-              <w:end w:val="single" w:sz="2" w:space="0" w:color="CCCCCC"/>
-            </w:tcBorders>
-          </w:tcPr>
-          <w:p>
-            <w:pPr>
-              <w:pStyle w:val="Normal"/>
-              <w:rPr>
-                <w:rFonts w:ascii="Arial" w:hAnsi="Arial" w:eastAsia="Arial" w:cs="Arial"/>
-                <w:color w:val="555555"/>
-                <w:sz w:val="20"/>
-                <w:szCs w:val="20"/>
-              </w:rPr>
-            </w:pPr>
-            <w:r>
-              <w:rPr>
-                <w:rFonts w:eastAsia="Arial" w:cs="Arial"/>
-                <w:color w:val="555555"/>
-                <w:sz w:val="20"/>
-                <w:szCs w:val="20"/>
-              </w:rPr>
-            </w:r>
-          </w:p>
-        </w:tc>
-      </w:tr>
-    </w:tbl>
-    <w:p>
-      <w:pPr>
-        <w:pStyle w:val="Normal"/>
-        <w:spacing w:before="200" w:after="0"/>
-        <w:rPr/>
-      </w:pPr>
-      <w:r>
-        <w:rPr/>
-      </w:r>
-    </w:p>
-    <w:p>
-      <w:pPr>
-        <w:pStyle w:val="Heading1"/>
-        <w:pBdr>
-          <w:bottom w:val="single" w:sz="6" w:space="4" w:color="2E7D32"/>
-        </w:pBdr>
-        <w:spacing w:before="360" w:after="120"/>
-        <w:rPr/>
-      </w:pPr>
-      <w:r>
-        <w:rPr>
-          <w:rFonts w:eastAsia="Arial" w:cs="Arial"/>
-          <w:b/>
-          <w:bCs/>
-          <w:color w:val="2E7D32"/>
-          <w:sz w:val="30"/>
-          <w:szCs w:val="30"/>
-        </w:rPr>
-        <w:t>10. Estrutura da Documentação Inicial</w:t>
-      </w:r>
-    </w:p>
-    <w:p>
-      <w:pPr>
-        <w:pStyle w:val="Normal"/>
-        <w:spacing w:before="60" w:after="80"/>
-        <w:rPr/>
-      </w:pPr>
-      <w:r>
-        <w:rPr>
-          <w:rFonts w:eastAsia="Arial" w:cs="Arial"/>
-          <w:color w:val="555555"/>
-          <w:sz w:val="22"/>
-          <w:szCs w:val="22"/>
-        </w:rPr>
-        <w:t>A documentação completa do projeto esta distribuída conforme abaixo:</w:t>
-      </w:r>
-    </w:p>
-    <w:p>
-      <w:pPr>
-        <w:pStyle w:val="Normal"/>
-        <w:spacing w:before="80" w:after="0"/>
-        <w:rPr/>
-      </w:pPr>
-      <w:r>
-        <w:rPr/>
-      </w:r>
-    </w:p>
-    <w:tbl>
-      <w:tblPr>
-        <w:tblW w:w="9360" w:type="dxa"/>
-        <w:jc w:val="start"/>
-        <w:tblInd w:w="0" w:type="dxa"/>
-        <w:tblLayout w:type="fixed"/>
-        <w:tblCellMar>
-          <w:top w:w="80" w:type="dxa"/>
-          <w:start w:w="120" w:type="dxa"/>
-          <w:bottom w:w="80" w:type="dxa"/>
-          <w:end w:w="120" w:type="dxa"/>
-        </w:tblCellMar>
-      </w:tblPr>
-      <w:tblGrid>
-        <w:gridCol w:w="3498"/>
-        <w:gridCol w:w="5862"/>
-      </w:tblGrid>
-      <w:tr>
-        <w:trPr/>
-        <w:tc>
-          <w:tcPr>
-            <w:tcW w:w="3498" w:type="dxa"/>
-            <w:tcBorders>
-              <w:top w:val="single" w:sz="2" w:space="0" w:color="CCCCCC"/>
-              <w:start w:val="single" w:sz="2" w:space="0" w:color="CCCCCC"/>
-              <w:bottom w:val="single" w:sz="2" w:space="0" w:color="CCCCCC"/>
-              <w:end w:val="single" w:sz="2" w:space="0" w:color="CCCCCC"/>
-            </w:tcBorders>
-            <w:shd w:fill="C8E6C9" w:val="clear"/>
-          </w:tcPr>
-          <w:p>
-            <w:pPr>
-              <w:pStyle w:val="Normal"/>
-              <w:rPr/>
-            </w:pPr>
-            <w:r>
-              <w:rPr>
-                <w:rFonts w:eastAsia="Arial" w:cs="Arial"/>
-                <w:b/>
-                <w:bCs/>
-                <w:color w:val="2E7D32"/>
-                <w:sz w:val="20"/>
-                <w:szCs w:val="20"/>
-              </w:rPr>
-              <w:t>Documento</w:t>
-            </w:r>
-          </w:p>
-        </w:tc>
-        <w:tc>
-          <w:tcPr>
-            <w:tcW w:w="5862" w:type="dxa"/>
-            <w:tcBorders>
-              <w:top w:val="single" w:sz="2" w:space="0" w:color="CCCCCC"/>
-              <w:start w:val="single" w:sz="2" w:space="0" w:color="CCCCCC"/>
-              <w:bottom w:val="single" w:sz="2" w:space="0" w:color="CCCCCC"/>
-              <w:end w:val="single" w:sz="2" w:space="0" w:color="CCCCCC"/>
-            </w:tcBorders>
-            <w:shd w:fill="C8E6C9" w:val="clear"/>
-          </w:tcPr>
-          <w:p>
-            <w:pPr>
-              <w:pStyle w:val="Normal"/>
-              <w:rPr/>
-            </w:pPr>
-            <w:r>
-              <w:rPr>
-                <w:rFonts w:eastAsia="Arial" w:cs="Arial"/>
-                <w:b/>
-                <w:bCs/>
-                <w:color w:val="2E7D32"/>
-                <w:sz w:val="20"/>
-                <w:szCs w:val="20"/>
-              </w:rPr>
-              <w:t>Localização</w:t>
-            </w:r>
-          </w:p>
-        </w:tc>
-      </w:tr>
-      <w:tr>
-        <w:trPr/>
-        <w:tc>
-          <w:tcPr>
-            <w:tcW w:w="3498" w:type="dxa"/>
+            <w:tcW w:w="3497" w:type="dxa"/>
             <w:tcBorders>
               <w:top w:val="single" w:sz="2" w:space="0" w:color="CCCCCC"/>
               <w:start w:val="single" w:sz="2" w:space="0" w:color="CCCCCC"/>
@@ -4010,7 +3708,7 @@
         </w:tc>
         <w:tc>
           <w:tcPr>
-            <w:tcW w:w="5862" w:type="dxa"/>
+            <w:tcW w:w="5863" w:type="dxa"/>
             <w:tcBorders>
               <w:top w:val="single" w:sz="2" w:space="0" w:color="CCCCCC"/>
               <w:start w:val="single" w:sz="2" w:space="0" w:color="CCCCCC"/>
@@ -4043,7 +3741,7 @@
         </w:trPr>
         <w:tc>
           <w:tcPr>
-            <w:tcW w:w="3498" w:type="dxa"/>
+            <w:tcW w:w="3497" w:type="dxa"/>
             <w:tcBorders>
               <w:start w:val="single" w:sz="2" w:space="0" w:color="CCCCCC"/>
               <w:bottom w:val="single" w:sz="2" w:space="0" w:color="CCCCCC"/>
@@ -4068,7 +3766,7 @@
         </w:tc>
         <w:tc>
           <w:tcPr>
-            <w:tcW w:w="5862" w:type="dxa"/>
+            <w:tcW w:w="5863" w:type="dxa"/>
             <w:tcBorders>
               <w:start w:val="single" w:sz="2" w:space="0" w:color="CCCCCC"/>
               <w:bottom w:val="single" w:sz="2" w:space="0" w:color="CCCCCC"/>
@@ -4126,7 +3824,7 @@
         <w:trPr/>
         <w:tc>
           <w:tcPr>
-            <w:tcW w:w="3498" w:type="dxa"/>
+            <w:tcW w:w="3497" w:type="dxa"/>
             <w:tcBorders>
               <w:start w:val="single" w:sz="2" w:space="0" w:color="CCCCCC"/>
               <w:bottom w:val="single" w:sz="2" w:space="0" w:color="CCCCCC"/>
@@ -4151,7 +3849,7 @@
         </w:tc>
         <w:tc>
           <w:tcPr>
-            <w:tcW w:w="5862" w:type="dxa"/>
+            <w:tcW w:w="5863" w:type="dxa"/>
             <w:tcBorders>
               <w:start w:val="single" w:sz="2" w:space="0" w:color="CCCCCC"/>
               <w:bottom w:val="single" w:sz="2" w:space="0" w:color="CCCCCC"/>
@@ -4182,7 +3880,7 @@
         <w:trPr/>
         <w:tc>
           <w:tcPr>
-            <w:tcW w:w="3498" w:type="dxa"/>
+            <w:tcW w:w="3497" w:type="dxa"/>
             <w:tcBorders>
               <w:top w:val="single" w:sz="2" w:space="0" w:color="CCCCCC"/>
               <w:start w:val="single" w:sz="2" w:space="0" w:color="CCCCCC"/>
@@ -4208,7 +3906,7 @@
         </w:tc>
         <w:tc>
           <w:tcPr>
-            <w:tcW w:w="5862" w:type="dxa"/>
+            <w:tcW w:w="5863" w:type="dxa"/>
             <w:tcBorders>
               <w:top w:val="single" w:sz="2" w:space="0" w:color="CCCCCC"/>
               <w:start w:val="single" w:sz="2" w:space="0" w:color="CCCCCC"/>
@@ -4240,7 +3938,7 @@
         <w:trPr/>
         <w:tc>
           <w:tcPr>
-            <w:tcW w:w="3498" w:type="dxa"/>
+            <w:tcW w:w="3497" w:type="dxa"/>
             <w:tcBorders>
               <w:top w:val="single" w:sz="2" w:space="0" w:color="CCCCCC"/>
               <w:start w:val="single" w:sz="2" w:space="0" w:color="CCCCCC"/>
@@ -4266,7 +3964,7 @@
         </w:tc>
         <w:tc>
           <w:tcPr>
-            <w:tcW w:w="5862" w:type="dxa"/>
+            <w:tcW w:w="5863" w:type="dxa"/>
             <w:tcBorders>
               <w:top w:val="single" w:sz="2" w:space="0" w:color="CCCCCC"/>
               <w:start w:val="single" w:sz="2" w:space="0" w:color="CCCCCC"/>
@@ -4495,46 +4193,6 @@
           <w:szCs w:val="22"/>
         </w:rPr>
         <w:t>A estrutura física do reservatório será construída pelos membros do projeto.</w:t>
-      </w:r>
-    </w:p>
-    <w:p>
-      <w:pPr>
-        <w:pStyle w:val="ListParagraph"/>
-        <w:spacing w:before="40" w:after="40"/>
-        <w:rPr>
-          <w:rFonts w:ascii="Arial" w:hAnsi="Arial" w:eastAsia="Arial" w:cs="Arial"/>
-          <w:color w:val="555555"/>
-          <w:sz w:val="22"/>
-          <w:szCs w:val="22"/>
-        </w:rPr>
-      </w:pPr>
-      <w:r>
-        <w:rPr>
-          <w:rFonts w:eastAsia="Arial" w:cs="Arial"/>
-          <w:color w:val="555555"/>
-          <w:sz w:val="22"/>
-          <w:szCs w:val="22"/>
-        </w:rPr>
-      </w:r>
-    </w:p>
-    <w:p>
-      <w:pPr>
-        <w:pStyle w:val="ListParagraph"/>
-        <w:spacing w:before="40" w:after="40"/>
-        <w:rPr>
-          <w:rFonts w:ascii="Arial" w:hAnsi="Arial" w:eastAsia="Arial" w:cs="Arial"/>
-          <w:color w:val="555555"/>
-          <w:sz w:val="22"/>
-          <w:szCs w:val="22"/>
-        </w:rPr>
-      </w:pPr>
-      <w:r>
-        <w:rPr>
-          <w:rFonts w:eastAsia="Arial" w:cs="Arial"/>
-          <w:color w:val="555555"/>
-          <w:sz w:val="22"/>
-          <w:szCs w:val="22"/>
-        </w:rPr>
       </w:r>
     </w:p>
     <w:p>
@@ -5031,6 +4689,143 @@
       <w:lvlJc w:val="start"/>
       <w:pPr>
         <w:tabs>
+          <w:tab w:val="num" w:pos="720"/>
+        </w:tabs>
+        <w:ind w:start="720" w:hanging="360"/>
+      </w:pPr>
+      <w:rPr>
+        <w:rFonts w:ascii="Symbol" w:hAnsi="Symbol" w:cs="Symbol" w:hint="default"/>
+      </w:rPr>
+    </w:lvl>
+    <w:lvl w:ilvl="1">
+      <w:start w:val="1"/>
+      <w:numFmt w:val="bullet"/>
+      <w:lvlText w:val="◦"/>
+      <w:lvlJc w:val="start"/>
+      <w:pPr>
+        <w:tabs>
+          <w:tab w:val="num" w:pos="1080"/>
+        </w:tabs>
+        <w:ind w:start="1080" w:hanging="360"/>
+      </w:pPr>
+      <w:rPr>
+        <w:rFonts w:ascii="OpenSymbol" w:hAnsi="OpenSymbol" w:cs="OpenSymbol" w:hint="default"/>
+      </w:rPr>
+    </w:lvl>
+    <w:lvl w:ilvl="2">
+      <w:start w:val="1"/>
+      <w:numFmt w:val="bullet"/>
+      <w:lvlText w:val="▪"/>
+      <w:lvlJc w:val="start"/>
+      <w:pPr>
+        <w:tabs>
+          <w:tab w:val="num" w:pos="1440"/>
+        </w:tabs>
+        <w:ind w:start="1440" w:hanging="360"/>
+      </w:pPr>
+      <w:rPr>
+        <w:rFonts w:ascii="OpenSymbol" w:hAnsi="OpenSymbol" w:cs="OpenSymbol" w:hint="default"/>
+      </w:rPr>
+    </w:lvl>
+    <w:lvl w:ilvl="3">
+      <w:start w:val="1"/>
+      <w:numFmt w:val="bullet"/>
+      <w:lvlText w:val=""/>
+      <w:lvlJc w:val="start"/>
+      <w:pPr>
+        <w:tabs>
+          <w:tab w:val="num" w:pos="1800"/>
+        </w:tabs>
+        <w:ind w:start="1800" w:hanging="360"/>
+      </w:pPr>
+      <w:rPr>
+        <w:rFonts w:ascii="Symbol" w:hAnsi="Symbol" w:cs="Symbol" w:hint="default"/>
+      </w:rPr>
+    </w:lvl>
+    <w:lvl w:ilvl="4">
+      <w:start w:val="1"/>
+      <w:numFmt w:val="bullet"/>
+      <w:lvlText w:val="◦"/>
+      <w:lvlJc w:val="start"/>
+      <w:pPr>
+        <w:tabs>
+          <w:tab w:val="num" w:pos="2160"/>
+        </w:tabs>
+        <w:ind w:start="2160" w:hanging="360"/>
+      </w:pPr>
+      <w:rPr>
+        <w:rFonts w:ascii="OpenSymbol" w:hAnsi="OpenSymbol" w:cs="OpenSymbol" w:hint="default"/>
+      </w:rPr>
+    </w:lvl>
+    <w:lvl w:ilvl="5">
+      <w:start w:val="1"/>
+      <w:numFmt w:val="bullet"/>
+      <w:lvlText w:val="▪"/>
+      <w:lvlJc w:val="start"/>
+      <w:pPr>
+        <w:tabs>
+          <w:tab w:val="num" w:pos="2520"/>
+        </w:tabs>
+        <w:ind w:start="2520" w:hanging="360"/>
+      </w:pPr>
+      <w:rPr>
+        <w:rFonts w:ascii="OpenSymbol" w:hAnsi="OpenSymbol" w:cs="OpenSymbol" w:hint="default"/>
+      </w:rPr>
+    </w:lvl>
+    <w:lvl w:ilvl="6">
+      <w:start w:val="1"/>
+      <w:numFmt w:val="bullet"/>
+      <w:lvlText w:val=""/>
+      <w:lvlJc w:val="start"/>
+      <w:pPr>
+        <w:tabs>
+          <w:tab w:val="num" w:pos="2880"/>
+        </w:tabs>
+        <w:ind w:start="2880" w:hanging="360"/>
+      </w:pPr>
+      <w:rPr>
+        <w:rFonts w:ascii="Symbol" w:hAnsi="Symbol" w:cs="Symbol" w:hint="default"/>
+      </w:rPr>
+    </w:lvl>
+    <w:lvl w:ilvl="7">
+      <w:start w:val="1"/>
+      <w:numFmt w:val="bullet"/>
+      <w:lvlText w:val="◦"/>
+      <w:lvlJc w:val="start"/>
+      <w:pPr>
+        <w:tabs>
+          <w:tab w:val="num" w:pos="3240"/>
+        </w:tabs>
+        <w:ind w:start="3240" w:hanging="360"/>
+      </w:pPr>
+      <w:rPr>
+        <w:rFonts w:ascii="OpenSymbol" w:hAnsi="OpenSymbol" w:cs="OpenSymbol" w:hint="default"/>
+      </w:rPr>
+    </w:lvl>
+    <w:lvl w:ilvl="8">
+      <w:start w:val="1"/>
+      <w:numFmt w:val="bullet"/>
+      <w:lvlText w:val="▪"/>
+      <w:lvlJc w:val="start"/>
+      <w:pPr>
+        <w:tabs>
+          <w:tab w:val="num" w:pos="3600"/>
+        </w:tabs>
+        <w:ind w:start="3600" w:hanging="360"/>
+      </w:pPr>
+      <w:rPr>
+        <w:rFonts w:ascii="OpenSymbol" w:hAnsi="OpenSymbol" w:cs="OpenSymbol" w:hint="default"/>
+      </w:rPr>
+    </w:lvl>
+  </w:abstractNum>
+  <w:abstractNum w:abstractNumId="2">
+    <w:lvl w:ilvl="0">
+      <w:start w:val="1"/>
+      <w:numFmt w:val="bullet"/>
+      <w:lvlText w:val=""/>
+      <w:lvlJc w:val="start"/>
+      <w:pPr>
+        <w:tabs>
           <w:tab w:val="num" w:pos="0"/>
         </w:tabs>
         <w:ind w:start="720" w:hanging="360"/>
@@ -5142,143 +4937,6 @@
         <w:ind w:start="3600" w:hanging="360"/>
       </w:pPr>
       <w:rPr/>
-    </w:lvl>
-  </w:abstractNum>
-  <w:abstractNum w:abstractNumId="2">
-    <w:lvl w:ilvl="0">
-      <w:start w:val="1"/>
-      <w:numFmt w:val="bullet"/>
-      <w:lvlText w:val=""/>
-      <w:lvlJc w:val="start"/>
-      <w:pPr>
-        <w:tabs>
-          <w:tab w:val="num" w:pos="720"/>
-        </w:tabs>
-        <w:ind w:start="720" w:hanging="360"/>
-      </w:pPr>
-      <w:rPr>
-        <w:rFonts w:ascii="Symbol" w:hAnsi="Symbol" w:cs="Symbol" w:hint="default"/>
-      </w:rPr>
-    </w:lvl>
-    <w:lvl w:ilvl="1">
-      <w:start w:val="1"/>
-      <w:numFmt w:val="bullet"/>
-      <w:lvlText w:val="◦"/>
-      <w:lvlJc w:val="start"/>
-      <w:pPr>
-        <w:tabs>
-          <w:tab w:val="num" w:pos="1080"/>
-        </w:tabs>
-        <w:ind w:start="1080" w:hanging="360"/>
-      </w:pPr>
-      <w:rPr>
-        <w:rFonts w:ascii="OpenSymbol" w:hAnsi="OpenSymbol" w:cs="OpenSymbol" w:hint="default"/>
-      </w:rPr>
-    </w:lvl>
-    <w:lvl w:ilvl="2">
-      <w:start w:val="1"/>
-      <w:numFmt w:val="bullet"/>
-      <w:lvlText w:val="▪"/>
-      <w:lvlJc w:val="start"/>
-      <w:pPr>
-        <w:tabs>
-          <w:tab w:val="num" w:pos="1440"/>
-        </w:tabs>
-        <w:ind w:start="1440" w:hanging="360"/>
-      </w:pPr>
-      <w:rPr>
-        <w:rFonts w:ascii="OpenSymbol" w:hAnsi="OpenSymbol" w:cs="OpenSymbol" w:hint="default"/>
-      </w:rPr>
-    </w:lvl>
-    <w:lvl w:ilvl="3">
-      <w:start w:val="1"/>
-      <w:numFmt w:val="bullet"/>
-      <w:lvlText w:val=""/>
-      <w:lvlJc w:val="start"/>
-      <w:pPr>
-        <w:tabs>
-          <w:tab w:val="num" w:pos="1800"/>
-        </w:tabs>
-        <w:ind w:start="1800" w:hanging="360"/>
-      </w:pPr>
-      <w:rPr>
-        <w:rFonts w:ascii="Symbol" w:hAnsi="Symbol" w:cs="Symbol" w:hint="default"/>
-      </w:rPr>
-    </w:lvl>
-    <w:lvl w:ilvl="4">
-      <w:start w:val="1"/>
-      <w:numFmt w:val="bullet"/>
-      <w:lvlText w:val="◦"/>
-      <w:lvlJc w:val="start"/>
-      <w:pPr>
-        <w:tabs>
-          <w:tab w:val="num" w:pos="2160"/>
-        </w:tabs>
-        <w:ind w:start="2160" w:hanging="360"/>
-      </w:pPr>
-      <w:rPr>
-        <w:rFonts w:ascii="OpenSymbol" w:hAnsi="OpenSymbol" w:cs="OpenSymbol" w:hint="default"/>
-      </w:rPr>
-    </w:lvl>
-    <w:lvl w:ilvl="5">
-      <w:start w:val="1"/>
-      <w:numFmt w:val="bullet"/>
-      <w:lvlText w:val="▪"/>
-      <w:lvlJc w:val="start"/>
-      <w:pPr>
-        <w:tabs>
-          <w:tab w:val="num" w:pos="2520"/>
-        </w:tabs>
-        <w:ind w:start="2520" w:hanging="360"/>
-      </w:pPr>
-      <w:rPr>
-        <w:rFonts w:ascii="OpenSymbol" w:hAnsi="OpenSymbol" w:cs="OpenSymbol" w:hint="default"/>
-      </w:rPr>
-    </w:lvl>
-    <w:lvl w:ilvl="6">
-      <w:start w:val="1"/>
-      <w:numFmt w:val="bullet"/>
-      <w:lvlText w:val=""/>
-      <w:lvlJc w:val="start"/>
-      <w:pPr>
-        <w:tabs>
-          <w:tab w:val="num" w:pos="2880"/>
-        </w:tabs>
-        <w:ind w:start="2880" w:hanging="360"/>
-      </w:pPr>
-      <w:rPr>
-        <w:rFonts w:ascii="Symbol" w:hAnsi="Symbol" w:cs="Symbol" w:hint="default"/>
-      </w:rPr>
-    </w:lvl>
-    <w:lvl w:ilvl="7">
-      <w:start w:val="1"/>
-      <w:numFmt w:val="bullet"/>
-      <w:lvlText w:val="◦"/>
-      <w:lvlJc w:val="start"/>
-      <w:pPr>
-        <w:tabs>
-          <w:tab w:val="num" w:pos="3240"/>
-        </w:tabs>
-        <w:ind w:start="3240" w:hanging="360"/>
-      </w:pPr>
-      <w:rPr>
-        <w:rFonts w:ascii="OpenSymbol" w:hAnsi="OpenSymbol" w:cs="OpenSymbol" w:hint="default"/>
-      </w:rPr>
-    </w:lvl>
-    <w:lvl w:ilvl="8">
-      <w:start w:val="1"/>
-      <w:numFmt w:val="bullet"/>
-      <w:lvlText w:val="▪"/>
-      <w:lvlJc w:val="start"/>
-      <w:pPr>
-        <w:tabs>
-          <w:tab w:val="num" w:pos="3600"/>
-        </w:tabs>
-        <w:ind w:start="3600" w:hanging="360"/>
-      </w:pPr>
-      <w:rPr>
-        <w:rFonts w:ascii="OpenSymbol" w:hAnsi="OpenSymbol" w:cs="OpenSymbol" w:hint="default"/>
-      </w:rPr>
     </w:lvl>
   </w:abstractNum>
   <w:abstractNum w:abstractNumId="3">
@@ -5580,7 +5238,7 @@
   </w:style>
   <w:style w:type="paragraph" w:styleId="Heading1">
     <w:name w:val="heading 1"/>
-    <w:basedOn w:val="Ttulouser"/>
+    <w:basedOn w:val="Ttulo"/>
     <w:qFormat/>
     <w:pPr>
       <w:spacing w:before="360" w:after="120"/>
@@ -5597,7 +5255,7 @@
   </w:style>
   <w:style w:type="paragraph" w:styleId="Heading2">
     <w:name w:val="heading 2"/>
-    <w:basedOn w:val="Ttulouser"/>
+    <w:basedOn w:val="Ttulo"/>
     <w:qFormat/>
     <w:pPr>
       <w:spacing w:before="280" w:after="100"/>
@@ -5614,7 +5272,7 @@
   </w:style>
   <w:style w:type="paragraph" w:styleId="Heading3">
     <w:name w:val="heading 3"/>
-    <w:basedOn w:val="Ttulouser"/>
+    <w:basedOn w:val="Ttulo"/>
     <w:qFormat/>
     <w:pPr>
       <w:spacing w:before="200" w:after="80"/>
@@ -5631,7 +5289,7 @@
   </w:style>
   <w:style w:type="paragraph" w:styleId="Heading4">
     <w:name w:val="heading 4"/>
-    <w:basedOn w:val="Ttulouser"/>
+    <w:basedOn w:val="Ttulo"/>
     <w:qFormat/>
     <w:pPr/>
     <w:rPr>
@@ -5642,7 +5300,7 @@
   </w:style>
   <w:style w:type="paragraph" w:styleId="Heading5">
     <w:name w:val="heading 5"/>
-    <w:basedOn w:val="Ttulouser"/>
+    <w:basedOn w:val="Ttulo"/>
     <w:qFormat/>
     <w:pPr/>
     <w:rPr>
@@ -5651,7 +5309,7 @@
   </w:style>
   <w:style w:type="paragraph" w:styleId="Heading6">
     <w:name w:val="heading 6"/>
-    <w:basedOn w:val="Ttulouser"/>
+    <w:basedOn w:val="Ttulo"/>
     <w:qFormat/>
     <w:pPr/>
     <w:rPr>
@@ -5667,18 +5325,15 @@
       <w:u w:val="single"/>
     </w:rPr>
   </w:style>
-  <w:style w:type="character" w:styleId="Caracteresdenotaderodapuser">
-    <w:name w:val="Caracteres de nota de rodapé (user)"/>
-    <w:uiPriority w:val="99"/>
-    <w:semiHidden/>
-    <w:unhideWhenUsed/>
+  <w:style w:type="character" w:styleId="Caracteresdenotaderodap">
+    <w:name w:val="Caracteres de nota de rodapé"/>
     <w:qFormat/>
     <w:rPr>
       <w:vertAlign w:val="superscript"/>
     </w:rPr>
   </w:style>
-  <w:style w:type="character" w:styleId="Caracteresdenotaderodap">
-    <w:name w:val="Caracteres de nota de rodapé"/>
+  <w:style w:type="character" w:styleId="FootnoteCharacters">
+    <w:name w:val="Footnote Characters"/>
     <w:qFormat/>
     <w:rPr>
       <w:vertAlign w:val="superscript"/>
@@ -5701,18 +5356,15 @@
       <w:szCs w:val="20"/>
     </w:rPr>
   </w:style>
-  <w:style w:type="character" w:styleId="Caracteresdenotadefimuser">
-    <w:name w:val="Caracteres de nota de fim (user)"/>
-    <w:uiPriority w:val="99"/>
-    <w:semiHidden/>
-    <w:unhideWhenUsed/>
+  <w:style w:type="character" w:styleId="Caracteresdenotadefim">
+    <w:name w:val="Caracteres de nota de fim"/>
     <w:qFormat/>
     <w:rPr>
       <w:vertAlign w:val="superscript"/>
     </w:rPr>
   </w:style>
-  <w:style w:type="character" w:styleId="Caracteresdenotadefim">
-    <w:name w:val="Caracteres de nota de fim"/>
+  <w:style w:type="character" w:styleId="EndnoteCharacters">
+    <w:name w:val="Endnote Characters"/>
     <w:qFormat/>
     <w:rPr>
       <w:vertAlign w:val="superscript"/>
@@ -5735,8 +5387,8 @@
       <w:szCs w:val="20"/>
     </w:rPr>
   </w:style>
-  <w:style w:type="character" w:styleId="Marcadoresuser">
-    <w:name w:val="Marcadores (user)"/>
+  <w:style w:type="character" w:styleId="Marcadores">
+    <w:name w:val="Marcadores"/>
     <w:qFormat/>
     <w:rPr>
       <w:rFonts w:ascii="OpenSymbol" w:hAnsi="OpenSymbol" w:eastAsia="OpenSymbol" w:cs="OpenSymbol"/>
@@ -5749,8 +5401,8 @@
       <w:u w:val="single"/>
     </w:rPr>
   </w:style>
-  <w:style w:type="paragraph" w:styleId="Ttulo">
-    <w:name w:val="Título"/>
+  <w:style w:type="paragraph" w:styleId="Heading">
+    <w:name w:val="Heading"/>
     <w:basedOn w:val="Normal"/>
     <w:next w:val="BodyText"/>
     <w:qFormat/>
@@ -5796,8 +5448,8 @@
       <w:szCs w:val="24"/>
     </w:rPr>
   </w:style>
-  <w:style w:type="paragraph" w:styleId="ndice">
-    <w:name w:val="Índice"/>
+  <w:style w:type="paragraph" w:styleId="Index">
+    <w:name w:val="Index"/>
     <w:basedOn w:val="Normal"/>
     <w:qFormat/>
     <w:pPr>
@@ -5807,8 +5459,8 @@
       <w:rFonts w:cs="Arial"/>
     </w:rPr>
   </w:style>
-  <w:style w:type="paragraph" w:styleId="Ttulouser">
-    <w:name w:val="Título (user)"/>
+  <w:style w:type="paragraph" w:styleId="Ttulo">
+    <w:name w:val="Título"/>
     <w:basedOn w:val="Normal"/>
     <w:next w:val="BodyText"/>
     <w:qFormat/>
@@ -5822,8 +5474,8 @@
       <w:szCs w:val="28"/>
     </w:rPr>
   </w:style>
-  <w:style w:type="paragraph" w:styleId="ndiceuser">
-    <w:name w:val="Índice (user)"/>
+  <w:style w:type="paragraph" w:styleId="ndice">
+    <w:name w:val="Índice"/>
     <w:basedOn w:val="Normal"/>
     <w:qFormat/>
     <w:pPr>
@@ -5835,7 +5487,7 @@
   </w:style>
   <w:style w:type="paragraph" w:styleId="Title">
     <w:name w:val="Title"/>
-    <w:basedOn w:val="Ttulouser"/>
+    <w:basedOn w:val="Ttulo"/>
     <w:qFormat/>
     <w:pPr/>
     <w:rPr>
@@ -5913,13 +5565,6 @@
       <w:szCs w:val="20"/>
     </w:rPr>
   </w:style>
-  <w:style w:type="paragraph" w:styleId="Cabealhoerodapuser">
-    <w:name w:val="Cabeçalho e rodapé (user)"/>
-    <w:basedOn w:val="Normal"/>
-    <w:qFormat/>
-    <w:pPr/>
-    <w:rPr/>
-  </w:style>
   <w:style w:type="paragraph" w:styleId="Cabealhoerodap">
     <w:name w:val="Cabeçalho e rodapé"/>
     <w:basedOn w:val="Normal"/>
@@ -5927,20 +5572,27 @@
     <w:pPr/>
     <w:rPr/>
   </w:style>
+  <w:style w:type="paragraph" w:styleId="HeaderandFooter">
+    <w:name w:val="Header and Footer"/>
+    <w:basedOn w:val="Normal"/>
+    <w:qFormat/>
+    <w:pPr/>
+    <w:rPr/>
+  </w:style>
   <w:style w:type="paragraph" w:styleId="Header">
     <w:name w:val="header"/>
-    <w:basedOn w:val="Cabealhoerodapuser"/>
+    <w:basedOn w:val="Cabealhoerodap"/>
     <w:pPr/>
     <w:rPr/>
   </w:style>
   <w:style w:type="paragraph" w:styleId="Footer">
     <w:name w:val="footer"/>
-    <w:basedOn w:val="Cabealhoerodapuser"/>
+    <w:basedOn w:val="Cabealhoerodap"/>
     <w:pPr/>
     <w:rPr/>
   </w:style>
-  <w:style w:type="paragraph" w:styleId="Contedodatabelauser">
-    <w:name w:val="Conteúdo da tabela (user)"/>
+  <w:style w:type="paragraph" w:styleId="Contedodatabela">
+    <w:name w:val="Conteúdo da tabela"/>
     <w:basedOn w:val="Normal"/>
     <w:qFormat/>
     <w:pPr>
@@ -5949,9 +5601,9 @@
     </w:pPr>
     <w:rPr/>
   </w:style>
-  <w:style w:type="paragraph" w:styleId="Ttulodetabelauser">
-    <w:name w:val="Título de tabela (user)"/>
-    <w:basedOn w:val="Contedodatabelauser"/>
+  <w:style w:type="paragraph" w:styleId="Ttulodetabela">
+    <w:name w:val="Título de tabela"/>
+    <w:basedOn w:val="Contedodatabela"/>
     <w:qFormat/>
     <w:pPr>
       <w:suppressLineNumbers/>

</xml_diff>

<commit_message>
Update README links and refresh docs
Replace README entries: point the Escopo link to the PDF and replace the previous Escopo PDF line with a Backlog_CornDrop.pdf link. Also update the documentation files doc/CornDrop_Documentacao_Escopo.docx.
</commit_message>
<xml_diff>
--- a/doc/CornDrop_Documentacao_Escopo.docx
+++ b/doc/CornDrop_Documentacao_Escopo.docx
@@ -3059,7 +3059,25 @@
           <w:sz w:val="22"/>
           <w:szCs w:val="22"/>
         </w:rPr>
-        <w:t>O backlog completo do projeto, com épicos e histórias de usuário detalhadas, esta estruturado e disponível no Notion.</w:t>
+        <w:t xml:space="preserve">O backlog completo do projeto, com épicos e histórias de usuário detalhadas, esta estruturado e disponível no </w:t>
+      </w:r>
+      <w:r>
+        <w:rPr>
+          <w:rFonts w:eastAsia="Arial" w:cs="Arial"/>
+          <w:color w:val="555555"/>
+          <w:sz w:val="22"/>
+          <w:szCs w:val="22"/>
+        </w:rPr>
+        <w:t>Projeto do GitHub e no documento de backlog</w:t>
+      </w:r>
+      <w:r>
+        <w:rPr>
+          <w:rFonts w:eastAsia="Arial" w:cs="Arial"/>
+          <w:color w:val="555555"/>
+          <w:sz w:val="22"/>
+          <w:szCs w:val="22"/>
+        </w:rPr>
+        <w:t>.</w:t>
       </w:r>
     </w:p>
     <w:p>
@@ -3165,16 +3183,21 @@
           <w:p>
             <w:pPr>
               <w:pStyle w:val="Normal"/>
-              <w:rPr/>
-            </w:pPr>
-            <w:r>
-              <w:rPr>
-                <w:rFonts w:eastAsia="Arial" w:cs="Arial"/>
-                <w:color w:val="555555"/>
-                <w:sz w:val="20"/>
-                <w:szCs w:val="20"/>
-              </w:rPr>
-              <w:t>EP-01</w:t>
+              <w:rPr>
+                <w:rFonts w:eastAsia="Arial" w:cs="Arial"/>
+                <w:color w:val="555555"/>
+                <w:sz w:val="20"/>
+                <w:szCs w:val="20"/>
+              </w:rPr>
+            </w:pPr>
+            <w:r>
+              <w:rPr>
+                <w:rFonts w:eastAsia="Arial" w:cs="Arial"/>
+                <w:color w:val="555555"/>
+                <w:sz w:val="20"/>
+                <w:szCs w:val="20"/>
+              </w:rPr>
+              <w:t xml:space="preserve">EP-01 — Autenticação e gestão de conta </w:t>
             </w:r>
           </w:p>
         </w:tc>
@@ -3205,16 +3228,7 @@
                 <w:sz w:val="20"/>
                 <w:szCs w:val="20"/>
               </w:rPr>
-              <w:t>D</w:t>
-            </w:r>
-            <w:r>
-              <w:rPr>
-                <w:rFonts w:eastAsia="Arial" w:cs="Arial"/>
-                <w:color w:val="555555"/>
-                <w:sz w:val="20"/>
-                <w:szCs w:val="20"/>
-              </w:rPr>
-              <w:t xml:space="preserve">esenvolvimento da tela principal de monitoramento do sistema, permitindo a visualização consolidada de indicadores operacionais, status dos dispositivos, consumo semanal, nível do reservatório. O módulo tem como objetivo fornecer uma visão rápida e estratégica da operação em tempo real. </w:t>
+              <w:t xml:space="preserve">Cobre todo o ciclo de identidade do usuário na plataforma: cadastro, login com JWT, recuperação de senha e edição de perfil. É a base que desbloqueia o acesso a todas as demais funcionalidades. Sem esse épico nenhuma outra tela ou recurso pode ser utilizado. </w:t>
             </w:r>
           </w:p>
         </w:tc>
@@ -3248,16 +3262,7 @@
                 <w:sz w:val="20"/>
                 <w:szCs w:val="20"/>
               </w:rPr>
-              <w:t>EP-0</w:t>
-            </w:r>
-            <w:r>
-              <w:rPr>
-                <w:rFonts w:eastAsia="Arial" w:cs="Arial"/>
-                <w:color w:val="555555"/>
-                <w:sz w:val="20"/>
-                <w:szCs w:val="20"/>
-              </w:rPr>
-              <w:t>2</w:t>
+              <w:t xml:space="preserve">EP-02 — Vinculação e configuração do dispositivo </w:t>
             </w:r>
           </w:p>
         </w:tc>
@@ -3288,7 +3293,7 @@
                 <w:sz w:val="20"/>
                 <w:szCs w:val="20"/>
               </w:rPr>
-              <w:t xml:space="preserve">Contempla o desenvolvimento das funcionalidades de gerenciamento dos dispositivos IoT vinculados ao sistema, incluindo cadastro, visualização de status e acesso aos detalhes individuais de cada dispositivo, garantindo controle operacional e rastreabilidade da infraestrutura. </w:t>
+              <w:t xml:space="preserve">Trata da ponte entre a conta do usuário e o hardware físico. Inclui o fluxo de pareamento via código único gerado pelo ESP32, monitoramento do status de conexão em tempo real, personalização do nome do dispositivo e desvinculação. É o épico de maior risco técnico por envolver a integração direta entre software e hardware IoT.  </w:t>
             </w:r>
           </w:p>
         </w:tc>
@@ -3324,16 +3329,7 @@
                 <w:sz w:val="20"/>
                 <w:szCs w:val="20"/>
               </w:rPr>
-              <w:t>EP-0</w:t>
-            </w:r>
-            <w:r>
-              <w:rPr>
-                <w:rFonts w:eastAsia="Arial" w:cs="Arial"/>
-                <w:color w:val="555555"/>
-                <w:sz w:val="20"/>
-                <w:szCs w:val="20"/>
-              </w:rPr>
-              <w:t>3</w:t>
+              <w:t xml:space="preserve">EP-03 — Programação de rotinas de alimentação </w:t>
             </w:r>
           </w:p>
         </w:tc>
@@ -3364,16 +3360,7 @@
                 <w:sz w:val="20"/>
                 <w:szCs w:val="20"/>
               </w:rPr>
-              <w:t>Implementação</w:t>
-            </w:r>
-            <w:r>
-              <w:rPr>
-                <w:rFonts w:eastAsia="Arial" w:cs="Arial"/>
-                <w:color w:val="555555"/>
-                <w:sz w:val="20"/>
-                <w:szCs w:val="20"/>
-              </w:rPr>
-              <w:t xml:space="preserve"> do módulo de controle de estoque, permitindo acompanhar níveis de insumos, registros de entrada e histórico de movimentações. O objetivo é fornecer suporte ao gerenciamento eficiente do abastecimento operacional. </w:t>
+              <w:t xml:space="preserve">Entrega o núcleo do produto: a capacidade de criar, editar, pausar e excluir horários automáticos de liberação de milho. Inclui a sincronização das rotinas com a memória não-volátil do ESP32, garantindo que o dispositivo continue executando os horários programados mesmo sem internet ativa — o diferencial técnico central do CornDrop. </w:t>
             </w:r>
           </w:p>
         </w:tc>
@@ -3407,16 +3394,7 @@
                 <w:sz w:val="20"/>
                 <w:szCs w:val="20"/>
               </w:rPr>
-              <w:t>EP-0</w:t>
-            </w:r>
-            <w:r>
-              <w:rPr>
-                <w:rFonts w:eastAsia="Arial" w:cs="Arial"/>
-                <w:color w:val="555555"/>
-                <w:sz w:val="20"/>
-                <w:szCs w:val="20"/>
-              </w:rPr>
-              <w:t>4</w:t>
+              <w:t xml:space="preserve">EP-04 — Controle manual e monitoramento em tempo real </w:t>
             </w:r>
           </w:p>
         </w:tc>
@@ -3447,7 +3425,7 @@
                 <w:sz w:val="20"/>
                 <w:szCs w:val="20"/>
               </w:rPr>
-              <w:t xml:space="preserve">Contempla o desenvolvimento das funcionalidades de criação, edição e gerenciamento de rotinas automáticas de alimentação, incluindo configuração de horários, frequência, dispositivos vinculados e monitoramento do consumo projetado. O módulo busca automatizar e otimizar a operação diária do sistema. </w:t>
+              <w:t xml:space="preserve">Oferece ao produtor visibilidade e controle imediato do sistema. Cobre o acionamento manual de liberação pelo aplicativo, a leitura do sensor de nível do reservatório, o histórico completo de alimentações automáticas e manuais e o dashboard de resumo diário. É o épico de maior valor percebido pelo usuário final no dia a dia. </w:t>
             </w:r>
           </w:p>
         </w:tc>
@@ -3480,16 +3458,7 @@
                 <w:sz w:val="20"/>
                 <w:szCs w:val="20"/>
               </w:rPr>
-              <w:t>EP-0</w:t>
-            </w:r>
-            <w:r>
-              <w:rPr>
-                <w:rFonts w:eastAsia="Arial" w:cs="Arial"/>
-                <w:color w:val="555555"/>
-                <w:sz w:val="20"/>
-                <w:szCs w:val="20"/>
-              </w:rPr>
-              <w:t>5</w:t>
+              <w:t xml:space="preserve">EP-05 — Notificações e alertas </w:t>
             </w:r>
           </w:p>
         </w:tc>
@@ -3519,25 +3488,133 @@
                 <w:sz w:val="20"/>
                 <w:szCs w:val="20"/>
               </w:rPr>
-              <w:t xml:space="preserve">Responsável pela implementação </w:t>
-            </w:r>
-            <w:r>
-              <w:rPr>
-                <w:rFonts w:eastAsia="Arial" w:cs="Arial"/>
-                <w:color w:val="555555"/>
-                <w:sz w:val="20"/>
-                <w:szCs w:val="20"/>
-              </w:rPr>
-              <w:t xml:space="preserve">da </w:t>
-            </w:r>
-            <w:r>
-              <w:rPr>
-                <w:rFonts w:eastAsia="Arial" w:cs="Arial"/>
-                <w:color w:val="555555"/>
-                <w:sz w:val="20"/>
-                <w:szCs w:val="20"/>
-              </w:rPr>
-              <w:t xml:space="preserve">estrutura visual compartilhada entre as telas do sistema, incluindo navbar desktop. O objetivo é garantir consistência visual, acessibilidade e fluidez na experiência do usuário em diferentes dispositivos. </w:t>
+              <w:t xml:space="preserve">Garante que o produtor seja informado proativamente sobre eventos críticos sem precisar abrir o aplicativo. Cobre o alerta de estoque baixo (nível ≤ 20%), a notificação de dispositivo offline por mais de 1 hora e a central de preferências onde o usuário escolhe quais alertas receber e por qual canal (e-mail ou push). </w:t>
+            </w:r>
+          </w:p>
+        </w:tc>
+      </w:tr>
+      <w:tr>
+        <w:trPr/>
+        <w:tc>
+          <w:tcPr>
+            <w:tcW w:w="1710" w:type="dxa"/>
+            <w:tcBorders>
+              <w:start w:val="single" w:sz="2" w:space="0" w:color="CCCCCC"/>
+              <w:bottom w:val="single" w:sz="2" w:space="0" w:color="CCCCCC"/>
+              <w:end w:val="single" w:sz="2" w:space="0" w:color="CCCCCC"/>
+            </w:tcBorders>
+          </w:tcPr>
+          <w:p>
+            <w:pPr>
+              <w:pStyle w:val="Normal"/>
+              <w:rPr>
+                <w:rFonts w:ascii="Arial" w:hAnsi="Arial" w:eastAsia="Arial" w:cs="Arial"/>
+                <w:color w:val="555555"/>
+                <w:sz w:val="20"/>
+                <w:szCs w:val="20"/>
+              </w:rPr>
+            </w:pPr>
+            <w:r>
+              <w:rPr>
+                <w:rFonts w:eastAsia="Arial" w:cs="Arial"/>
+                <w:color w:val="555555"/>
+                <w:sz w:val="20"/>
+                <w:szCs w:val="20"/>
+              </w:rPr>
+              <w:t xml:space="preserve">EP-06 — Infraestrutura, DevOps e hardware </w:t>
+            </w:r>
+          </w:p>
+        </w:tc>
+        <w:tc>
+          <w:tcPr>
+            <w:tcW w:w="7650" w:type="dxa"/>
+            <w:tcBorders>
+              <w:start w:val="single" w:sz="2" w:space="0" w:color="CCCCCC"/>
+              <w:bottom w:val="single" w:sz="2" w:space="0" w:color="CCCCCC"/>
+              <w:end w:val="single" w:sz="2" w:space="0" w:color="CCCCCC"/>
+            </w:tcBorders>
+          </w:tcPr>
+          <w:p>
+            <w:pPr>
+              <w:pStyle w:val="Normal"/>
+              <w:rPr>
+                <w:rFonts w:ascii="Arial" w:hAnsi="Arial" w:eastAsia="Arial" w:cs="Arial"/>
+                <w:color w:val="555555"/>
+                <w:sz w:val="20"/>
+                <w:szCs w:val="20"/>
+              </w:rPr>
+            </w:pPr>
+            <w:r>
+              <w:rPr>
+                <w:rFonts w:eastAsia="Arial" w:cs="Arial"/>
+                <w:color w:val="555555"/>
+                <w:sz w:val="20"/>
+                <w:szCs w:val="20"/>
+              </w:rPr>
+              <w:t xml:space="preserve">Épico técnico que sustenta todos os outros. Cobre a conteinerização do back-end Spring Boot com PostgreSQL via Docker Compose, a comunicação segura entre ESP32 e API via HTTPS com autenticação por token, e a integração do sensor de nível com envio periódico de leituras à API. Precisa estar concluído antes que qualquer funcionalidade de produto possa ser testada de ponta a ponta. </w:t>
+            </w:r>
+          </w:p>
+        </w:tc>
+      </w:tr>
+      <w:tr>
+        <w:trPr/>
+        <w:tc>
+          <w:tcPr>
+            <w:tcW w:w="1710" w:type="dxa"/>
+            <w:tcBorders>
+              <w:start w:val="single" w:sz="2" w:space="0" w:color="CCCCCC"/>
+              <w:bottom w:val="single" w:sz="2" w:space="0" w:color="CCCCCC"/>
+              <w:end w:val="single" w:sz="2" w:space="0" w:color="CCCCCC"/>
+            </w:tcBorders>
+          </w:tcPr>
+          <w:p>
+            <w:pPr>
+              <w:pStyle w:val="Normal"/>
+              <w:rPr>
+                <w:rFonts w:ascii="Arial" w:hAnsi="Arial" w:eastAsia="Arial" w:cs="Arial"/>
+                <w:color w:val="555555"/>
+                <w:sz w:val="20"/>
+                <w:szCs w:val="20"/>
+              </w:rPr>
+            </w:pPr>
+            <w:r>
+              <w:rPr>
+                <w:rFonts w:eastAsia="Arial" w:cs="Arial"/>
+                <w:color w:val="555555"/>
+                <w:sz w:val="20"/>
+                <w:szCs w:val="20"/>
+              </w:rPr>
+              <w:t xml:space="preserve">EP-07 — Desenvolvimento de telas </w:t>
+            </w:r>
+          </w:p>
+        </w:tc>
+        <w:tc>
+          <w:tcPr>
+            <w:tcW w:w="7650" w:type="dxa"/>
+            <w:tcBorders>
+              <w:start w:val="single" w:sz="2" w:space="0" w:color="CCCCCC"/>
+              <w:bottom w:val="single" w:sz="2" w:space="0" w:color="CCCCCC"/>
+              <w:end w:val="single" w:sz="2" w:space="0" w:color="CCCCCC"/>
+            </w:tcBorders>
+          </w:tcPr>
+          <w:p>
+            <w:pPr>
+              <w:pStyle w:val="Normal"/>
+              <w:rPr>
+                <w:rFonts w:ascii="Arial" w:hAnsi="Arial" w:eastAsia="Arial" w:cs="Arial"/>
+                <w:color w:val="555555"/>
+                <w:sz w:val="20"/>
+                <w:szCs w:val="20"/>
+              </w:rPr>
+            </w:pPr>
+            <w:r>
+              <w:rPr>
+                <w:rFonts w:eastAsia="Arial" w:cs="Arial"/>
+                <w:color w:val="555555"/>
+                <w:sz w:val="20"/>
+                <w:szCs w:val="20"/>
+              </w:rPr>
+              <w:t xml:space="preserve">Implementa as interfaces visuais baseadas nos protótipos de alta fidelidade. Cobre as quatro telas principais (Dashboard, Devices, Stock e Schedule) com todos os seus componentes, cards, gráficos, formulários e listas, além da barra de navegação superior para desktop e a bottom navigation para mobile. Cada história deste épico está diretamente rastreável a um elemento específico dos protótipos entregues. </w:t>
             </w:r>
           </w:p>
         </w:tc>
@@ -3547,10 +3624,27 @@
       <w:pPr>
         <w:pStyle w:val="Normal"/>
         <w:spacing w:before="200" w:after="0"/>
-        <w:rPr/>
-      </w:pPr>
-      <w:r>
-        <w:rPr/>
+        <w:rPr>
+          <w:rFonts w:eastAsia="Arial" w:cs="Arial"/>
+          <w:b/>
+          <w:bCs/>
+          <w:color w:val="2E7D32"/>
+          <w:sz w:val="30"/>
+          <w:szCs w:val="30"/>
+        </w:rPr>
+      </w:pPr>
+      <w:r>
+        <w:rPr>
+          <w:rFonts w:eastAsia="Arial" w:cs="Arial"/>
+          <w:b/>
+          <w:bCs/>
+          <w:color w:val="2E7D32"/>
+          <w:sz w:val="30"/>
+          <w:szCs w:val="30"/>
+        </w:rPr>
+      </w:r>
+      <w:r>
+        <w:br w:type="page"/>
       </w:r>
     </w:p>
     <w:p>
@@ -3560,7 +3654,14 @@
           <w:bottom w:val="single" w:sz="6" w:space="4" w:color="2E7D32"/>
         </w:pBdr>
         <w:spacing w:before="360" w:after="120"/>
-        <w:rPr/>
+        <w:rPr>
+          <w:rFonts w:eastAsia="Arial" w:cs="Arial"/>
+          <w:b/>
+          <w:bCs/>
+          <w:color w:val="2E7D32"/>
+          <w:sz w:val="30"/>
+          <w:szCs w:val="30"/>
+        </w:rPr>
       </w:pPr>
       <w:r>
         <w:rPr>
@@ -3614,14 +3715,14 @@
         </w:tblCellMar>
       </w:tblPr>
       <w:tblGrid>
-        <w:gridCol w:w="3497"/>
-        <w:gridCol w:w="5863"/>
+        <w:gridCol w:w="3496"/>
+        <w:gridCol w:w="5864"/>
       </w:tblGrid>
       <w:tr>
         <w:trPr/>
         <w:tc>
           <w:tcPr>
-            <w:tcW w:w="3497" w:type="dxa"/>
+            <w:tcW w:w="3496" w:type="dxa"/>
             <w:tcBorders>
               <w:top w:val="single" w:sz="2" w:space="0" w:color="CCCCCC"/>
               <w:start w:val="single" w:sz="2" w:space="0" w:color="CCCCCC"/>
@@ -3650,7 +3751,7 @@
         </w:tc>
         <w:tc>
           <w:tcPr>
-            <w:tcW w:w="5863" w:type="dxa"/>
+            <w:tcW w:w="5864" w:type="dxa"/>
             <w:tcBorders>
               <w:top w:val="single" w:sz="2" w:space="0" w:color="CCCCCC"/>
               <w:start w:val="single" w:sz="2" w:space="0" w:color="CCCCCC"/>
@@ -3682,7 +3783,7 @@
         <w:trPr/>
         <w:tc>
           <w:tcPr>
-            <w:tcW w:w="3497" w:type="dxa"/>
+            <w:tcW w:w="3496" w:type="dxa"/>
             <w:tcBorders>
               <w:top w:val="single" w:sz="2" w:space="0" w:color="CCCCCC"/>
               <w:start w:val="single" w:sz="2" w:space="0" w:color="CCCCCC"/>
@@ -3708,7 +3809,7 @@
         </w:tc>
         <w:tc>
           <w:tcPr>
-            <w:tcW w:w="5863" w:type="dxa"/>
+            <w:tcW w:w="5864" w:type="dxa"/>
             <w:tcBorders>
               <w:top w:val="single" w:sz="2" w:space="0" w:color="CCCCCC"/>
               <w:start w:val="single" w:sz="2" w:space="0" w:color="CCCCCC"/>
@@ -3741,7 +3842,7 @@
         </w:trPr>
         <w:tc>
           <w:tcPr>
-            <w:tcW w:w="3497" w:type="dxa"/>
+            <w:tcW w:w="3496" w:type="dxa"/>
             <w:tcBorders>
               <w:start w:val="single" w:sz="2" w:space="0" w:color="CCCCCC"/>
               <w:bottom w:val="single" w:sz="2" w:space="0" w:color="CCCCCC"/>
@@ -3766,7 +3867,7 @@
         </w:tc>
         <w:tc>
           <w:tcPr>
-            <w:tcW w:w="5863" w:type="dxa"/>
+            <w:tcW w:w="5864" w:type="dxa"/>
             <w:tcBorders>
               <w:start w:val="single" w:sz="2" w:space="0" w:color="CCCCCC"/>
               <w:bottom w:val="single" w:sz="2" w:space="0" w:color="CCCCCC"/>
@@ -3824,7 +3925,7 @@
         <w:trPr/>
         <w:tc>
           <w:tcPr>
-            <w:tcW w:w="3497" w:type="dxa"/>
+            <w:tcW w:w="3496" w:type="dxa"/>
             <w:tcBorders>
               <w:start w:val="single" w:sz="2" w:space="0" w:color="CCCCCC"/>
               <w:bottom w:val="single" w:sz="2" w:space="0" w:color="CCCCCC"/>
@@ -3849,7 +3950,7 @@
         </w:tc>
         <w:tc>
           <w:tcPr>
-            <w:tcW w:w="5863" w:type="dxa"/>
+            <w:tcW w:w="5864" w:type="dxa"/>
             <w:tcBorders>
               <w:start w:val="single" w:sz="2" w:space="0" w:color="CCCCCC"/>
               <w:bottom w:val="single" w:sz="2" w:space="0" w:color="CCCCCC"/>
@@ -3880,7 +3981,7 @@
         <w:trPr/>
         <w:tc>
           <w:tcPr>
-            <w:tcW w:w="3497" w:type="dxa"/>
+            <w:tcW w:w="3496" w:type="dxa"/>
             <w:tcBorders>
               <w:top w:val="single" w:sz="2" w:space="0" w:color="CCCCCC"/>
               <w:start w:val="single" w:sz="2" w:space="0" w:color="CCCCCC"/>
@@ -3906,7 +4007,7 @@
         </w:tc>
         <w:tc>
           <w:tcPr>
-            <w:tcW w:w="5863" w:type="dxa"/>
+            <w:tcW w:w="5864" w:type="dxa"/>
             <w:tcBorders>
               <w:top w:val="single" w:sz="2" w:space="0" w:color="CCCCCC"/>
               <w:start w:val="single" w:sz="2" w:space="0" w:color="CCCCCC"/>
@@ -3938,43 +4039,44 @@
         <w:trPr/>
         <w:tc>
           <w:tcPr>
-            <w:tcW w:w="3497" w:type="dxa"/>
-            <w:tcBorders>
-              <w:top w:val="single" w:sz="2" w:space="0" w:color="CCCCCC"/>
-              <w:start w:val="single" w:sz="2" w:space="0" w:color="CCCCCC"/>
-              <w:bottom w:val="single" w:sz="2" w:space="0" w:color="CCCCCC"/>
-              <w:end w:val="single" w:sz="2" w:space="0" w:color="CCCCCC"/>
-            </w:tcBorders>
-          </w:tcPr>
-          <w:p>
-            <w:pPr>
-              <w:pStyle w:val="Normal"/>
-              <w:rPr/>
-            </w:pPr>
-            <w:r>
-              <w:rPr>
-                <w:rFonts w:eastAsia="Arial" w:cs="Arial"/>
-                <w:color w:val="555555"/>
-                <w:sz w:val="20"/>
-                <w:szCs w:val="20"/>
-              </w:rPr>
-              <w:t>Backlog (Epics &amp; User Stories)</w:t>
-            </w:r>
-          </w:p>
-        </w:tc>
-        <w:tc>
-          <w:tcPr>
-            <w:tcW w:w="5863" w:type="dxa"/>
-            <w:tcBorders>
-              <w:top w:val="single" w:sz="2" w:space="0" w:color="CCCCCC"/>
-              <w:start w:val="single" w:sz="2" w:space="0" w:color="CCCCCC"/>
-              <w:bottom w:val="single" w:sz="2" w:space="0" w:color="CCCCCC"/>
-              <w:end w:val="single" w:sz="2" w:space="0" w:color="CCCCCC"/>
-            </w:tcBorders>
-          </w:tcPr>
-          <w:p>
-            <w:pPr>
-              <w:pStyle w:val="Normal"/>
+            <w:tcW w:w="3496" w:type="dxa"/>
+            <w:tcBorders>
+              <w:top w:val="single" w:sz="2" w:space="0" w:color="CCCCCC"/>
+              <w:start w:val="single" w:sz="2" w:space="0" w:color="CCCCCC"/>
+              <w:bottom w:val="single" w:sz="2" w:space="0" w:color="CCCCCC"/>
+              <w:end w:val="single" w:sz="2" w:space="0" w:color="CCCCCC"/>
+            </w:tcBorders>
+          </w:tcPr>
+          <w:p>
+            <w:pPr>
+              <w:pStyle w:val="Normal"/>
+              <w:rPr/>
+            </w:pPr>
+            <w:r>
+              <w:rPr>
+                <w:rFonts w:eastAsia="Arial" w:cs="Arial"/>
+                <w:color w:val="555555"/>
+                <w:sz w:val="20"/>
+                <w:szCs w:val="20"/>
+              </w:rPr>
+              <w:t>Backlog (User Stories)</w:t>
+            </w:r>
+          </w:p>
+        </w:tc>
+        <w:tc>
+          <w:tcPr>
+            <w:tcW w:w="5864" w:type="dxa"/>
+            <w:tcBorders>
+              <w:top w:val="single" w:sz="2" w:space="0" w:color="CCCCCC"/>
+              <w:start w:val="single" w:sz="2" w:space="0" w:color="CCCCCC"/>
+              <w:bottom w:val="single" w:sz="2" w:space="0" w:color="CCCCCC"/>
+              <w:end w:val="single" w:sz="2" w:space="0" w:color="CCCCCC"/>
+            </w:tcBorders>
+          </w:tcPr>
+          <w:p>
+            <w:pPr>
+              <w:pStyle w:val="BodyText"/>
+              <w:spacing w:lineRule="auto" w:line="276" w:before="0" w:after="140"/>
               <w:rPr/>
             </w:pPr>
             <w:hyperlink r:id="rId5">
@@ -4248,9 +4350,9 @@
     </w:p>
     <w:tbl>
       <w:tblPr>
-        <w:tblW w:w="9360" w:type="dxa"/>
+        <w:tblW w:w="9332" w:type="dxa"/>
         <w:jc w:val="start"/>
-        <w:tblInd w:w="0" w:type="dxa"/>
+        <w:tblInd w:w="28" w:type="dxa"/>
         <w:tblLayout w:type="fixed"/>
         <w:tblCellMar>
           <w:top w:w="80" w:type="dxa"/>
@@ -4260,16 +4362,16 @@
         </w:tblCellMar>
       </w:tblPr>
       <w:tblGrid>
-        <w:gridCol w:w="1560"/>
-        <w:gridCol w:w="2340"/>
-        <w:gridCol w:w="3120"/>
-        <w:gridCol w:w="2340"/>
+        <w:gridCol w:w="1020"/>
+        <w:gridCol w:w="1530"/>
+        <w:gridCol w:w="4680"/>
+        <w:gridCol w:w="2102"/>
       </w:tblGrid>
       <w:tr>
         <w:trPr/>
         <w:tc>
           <w:tcPr>
-            <w:tcW w:w="1560" w:type="dxa"/>
+            <w:tcW w:w="1020" w:type="dxa"/>
             <w:tcBorders>
               <w:top w:val="single" w:sz="2" w:space="0" w:color="CCCCCC"/>
               <w:start w:val="single" w:sz="2" w:space="0" w:color="CCCCCC"/>
@@ -4298,7 +4400,7 @@
         </w:tc>
         <w:tc>
           <w:tcPr>
-            <w:tcW w:w="2340" w:type="dxa"/>
+            <w:tcW w:w="1530" w:type="dxa"/>
             <w:tcBorders>
               <w:top w:val="single" w:sz="2" w:space="0" w:color="CCCCCC"/>
               <w:start w:val="single" w:sz="2" w:space="0" w:color="CCCCCC"/>
@@ -4327,7 +4429,7 @@
         </w:tc>
         <w:tc>
           <w:tcPr>
-            <w:tcW w:w="3120" w:type="dxa"/>
+            <w:tcW w:w="4680" w:type="dxa"/>
             <w:tcBorders>
               <w:top w:val="single" w:sz="2" w:space="0" w:color="CCCCCC"/>
               <w:start w:val="single" w:sz="2" w:space="0" w:color="CCCCCC"/>
@@ -4356,7 +4458,7 @@
         </w:tc>
         <w:tc>
           <w:tcPr>
-            <w:tcW w:w="2340" w:type="dxa"/>
+            <w:tcW w:w="2102" w:type="dxa"/>
             <w:tcBorders>
               <w:top w:val="single" w:sz="2" w:space="0" w:color="CCCCCC"/>
               <w:start w:val="single" w:sz="2" w:space="0" w:color="CCCCCC"/>
@@ -4388,7 +4490,7 @@
         <w:trPr/>
         <w:tc>
           <w:tcPr>
-            <w:tcW w:w="1560" w:type="dxa"/>
+            <w:tcW w:w="1020" w:type="dxa"/>
             <w:tcBorders>
               <w:top w:val="single" w:sz="2" w:space="0" w:color="CCCCCC"/>
               <w:start w:val="single" w:sz="2" w:space="0" w:color="CCCCCC"/>
@@ -4414,7 +4516,7 @@
         </w:tc>
         <w:tc>
           <w:tcPr>
-            <w:tcW w:w="2340" w:type="dxa"/>
+            <w:tcW w:w="1530" w:type="dxa"/>
             <w:tcBorders>
               <w:top w:val="single" w:sz="2" w:space="0" w:color="CCCCCC"/>
               <w:start w:val="single" w:sz="2" w:space="0" w:color="CCCCCC"/>
@@ -4440,7 +4542,7 @@
         </w:tc>
         <w:tc>
           <w:tcPr>
-            <w:tcW w:w="3120" w:type="dxa"/>
+            <w:tcW w:w="4680" w:type="dxa"/>
             <w:tcBorders>
               <w:top w:val="single" w:sz="2" w:space="0" w:color="CCCCCC"/>
               <w:start w:val="single" w:sz="2" w:space="0" w:color="CCCCCC"/>
@@ -4466,27 +4568,148 @@
         </w:tc>
         <w:tc>
           <w:tcPr>
-            <w:tcW w:w="2340" w:type="dxa"/>
-            <w:tcBorders>
-              <w:top w:val="single" w:sz="2" w:space="0" w:color="CCCCCC"/>
-              <w:start w:val="single" w:sz="2" w:space="0" w:color="CCCCCC"/>
-              <w:bottom w:val="single" w:sz="2" w:space="0" w:color="CCCCCC"/>
-              <w:end w:val="single" w:sz="2" w:space="0" w:color="CCCCCC"/>
-            </w:tcBorders>
-          </w:tcPr>
-          <w:p>
-            <w:pPr>
-              <w:pStyle w:val="Normal"/>
-              <w:rPr/>
-            </w:pPr>
-            <w:r>
-              <w:rPr>
-                <w:rFonts w:eastAsia="Arial" w:cs="Arial"/>
-                <w:color w:val="555555"/>
-                <w:sz w:val="20"/>
-                <w:szCs w:val="20"/>
-              </w:rPr>
-              <w:t>Cauane Gonçalves de Oliveira</w:t>
+            <w:tcW w:w="2102" w:type="dxa"/>
+            <w:tcBorders>
+              <w:top w:val="single" w:sz="2" w:space="0" w:color="CCCCCC"/>
+              <w:start w:val="single" w:sz="2" w:space="0" w:color="CCCCCC"/>
+              <w:bottom w:val="single" w:sz="2" w:space="0" w:color="CCCCCC"/>
+              <w:end w:val="single" w:sz="2" w:space="0" w:color="CCCCCC"/>
+            </w:tcBorders>
+          </w:tcPr>
+          <w:p>
+            <w:pPr>
+              <w:pStyle w:val="Normal"/>
+              <w:rPr/>
+            </w:pPr>
+            <w:r>
+              <w:rPr>
+                <w:rFonts w:eastAsia="Arial" w:cs="Arial"/>
+                <w:color w:val="555555"/>
+                <w:sz w:val="20"/>
+                <w:szCs w:val="20"/>
+              </w:rPr>
+              <w:t>Cauane Oliveira</w:t>
+            </w:r>
+          </w:p>
+        </w:tc>
+      </w:tr>
+      <w:tr>
+        <w:trPr/>
+        <w:tc>
+          <w:tcPr>
+            <w:tcW w:w="1020" w:type="dxa"/>
+            <w:tcBorders>
+              <w:start w:val="single" w:sz="2" w:space="0" w:color="CCCCCC"/>
+              <w:bottom w:val="single" w:sz="2" w:space="0" w:color="CCCCCC"/>
+              <w:end w:val="single" w:sz="2" w:space="0" w:color="CCCCCC"/>
+            </w:tcBorders>
+          </w:tcPr>
+          <w:p>
+            <w:pPr>
+              <w:pStyle w:val="Normal"/>
+              <w:rPr/>
+            </w:pPr>
+            <w:r>
+              <w:rPr>
+                <w:rFonts w:eastAsia="Arial" w:cs="Arial"/>
+                <w:color w:val="555555"/>
+                <w:sz w:val="20"/>
+                <w:szCs w:val="20"/>
+              </w:rPr>
+              <w:t>1.</w:t>
+            </w:r>
+            <w:r>
+              <w:rPr>
+                <w:rFonts w:eastAsia="Arial" w:cs="Arial"/>
+                <w:color w:val="555555"/>
+                <w:sz w:val="20"/>
+                <w:szCs w:val="20"/>
+              </w:rPr>
+              <w:t>1</w:t>
+            </w:r>
+          </w:p>
+        </w:tc>
+        <w:tc>
+          <w:tcPr>
+            <w:tcW w:w="1530" w:type="dxa"/>
+            <w:tcBorders>
+              <w:start w:val="single" w:sz="2" w:space="0" w:color="CCCCCC"/>
+              <w:bottom w:val="single" w:sz="2" w:space="0" w:color="CCCCCC"/>
+              <w:end w:val="single" w:sz="2" w:space="0" w:color="CCCCCC"/>
+            </w:tcBorders>
+          </w:tcPr>
+          <w:p>
+            <w:pPr>
+              <w:pStyle w:val="Normal"/>
+              <w:rPr/>
+            </w:pPr>
+            <w:r>
+              <w:rPr>
+                <w:rFonts w:eastAsia="Arial" w:cs="Arial"/>
+                <w:color w:val="555555"/>
+                <w:sz w:val="20"/>
+                <w:szCs w:val="20"/>
+              </w:rPr>
+              <w:t>May</w:t>
+            </w:r>
+            <w:r>
+              <w:rPr>
+                <w:rFonts w:eastAsia="Arial" w:cs="Arial"/>
+                <w:color w:val="555555"/>
+                <w:sz w:val="20"/>
+                <w:szCs w:val="20"/>
+              </w:rPr>
+              <w:t>/2026</w:t>
+            </w:r>
+          </w:p>
+        </w:tc>
+        <w:tc>
+          <w:tcPr>
+            <w:tcW w:w="4680" w:type="dxa"/>
+            <w:tcBorders>
+              <w:start w:val="single" w:sz="2" w:space="0" w:color="CCCCCC"/>
+              <w:bottom w:val="single" w:sz="2" w:space="0" w:color="CCCCCC"/>
+              <w:end w:val="single" w:sz="2" w:space="0" w:color="CCCCCC"/>
+            </w:tcBorders>
+          </w:tcPr>
+          <w:p>
+            <w:pPr>
+              <w:pStyle w:val="Normal"/>
+              <w:rPr/>
+            </w:pPr>
+            <w:r>
+              <w:rPr>
+                <w:rFonts w:eastAsia="Arial" w:cs="Arial"/>
+                <w:color w:val="555555"/>
+                <w:sz w:val="20"/>
+                <w:szCs w:val="20"/>
+              </w:rPr>
+              <w:t>Ajuste de Backlog</w:t>
+            </w:r>
+          </w:p>
+        </w:tc>
+        <w:tc>
+          <w:tcPr>
+            <w:tcW w:w="2102" w:type="dxa"/>
+            <w:tcBorders>
+              <w:start w:val="single" w:sz="2" w:space="0" w:color="CCCCCC"/>
+              <w:bottom w:val="single" w:sz="2" w:space="0" w:color="CCCCCC"/>
+              <w:end w:val="single" w:sz="2" w:space="0" w:color="CCCCCC"/>
+            </w:tcBorders>
+          </w:tcPr>
+          <w:p>
+            <w:pPr>
+              <w:pStyle w:val="Normal"/>
+              <w:rPr/>
+            </w:pPr>
+            <w:r>
+              <w:rPr>
+                <w:rFonts w:eastAsia="Arial" w:cs="Arial"/>
+                <w:color w:val="555555"/>
+                <w:sz w:val="20"/>
+                <w:szCs w:val="20"/>
+              </w:rPr>
+              <w:t>Cauane Oliveira</w:t>
             </w:r>
           </w:p>
         </w:tc>
@@ -5332,6 +5555,13 @@
       <w:vertAlign w:val="superscript"/>
     </w:rPr>
   </w:style>
+  <w:style w:type="character" w:styleId="FootnoteCharactersuser">
+    <w:name w:val="Footnote Characters (user)"/>
+    <w:qFormat/>
+    <w:rPr>
+      <w:vertAlign w:val="superscript"/>
+    </w:rPr>
+  </w:style>
   <w:style w:type="character" w:styleId="FootnoteCharacters">
     <w:name w:val="Footnote Characters"/>
     <w:qFormat/>
@@ -5358,6 +5588,13 @@
   </w:style>
   <w:style w:type="character" w:styleId="Caracteresdenotadefim">
     <w:name w:val="Caracteres de nota de fim"/>
+    <w:qFormat/>
+    <w:rPr>
+      <w:vertAlign w:val="superscript"/>
+    </w:rPr>
+  </w:style>
+  <w:style w:type="character" w:styleId="EndnoteCharactersuser">
+    <w:name w:val="Endnote Characters (user)"/>
     <w:qFormat/>
     <w:rPr>
       <w:vertAlign w:val="superscript"/>
@@ -5614,6 +5851,29 @@
       <w:bCs/>
     </w:rPr>
   </w:style>
+  <w:style w:type="paragraph" w:styleId="TableContents">
+    <w:name w:val="Table Contents"/>
+    <w:basedOn w:val="Normal"/>
+    <w:qFormat/>
+    <w:pPr>
+      <w:widowControl w:val="false"/>
+      <w:suppressLineNumbers/>
+    </w:pPr>
+    <w:rPr/>
+  </w:style>
+  <w:style w:type="paragraph" w:styleId="TableHeading">
+    <w:name w:val="Table Heading"/>
+    <w:basedOn w:val="TableContents"/>
+    <w:qFormat/>
+    <w:pPr>
+      <w:suppressLineNumbers/>
+      <w:jc w:val="center"/>
+    </w:pPr>
+    <w:rPr>
+      <w:b/>
+      <w:bCs/>
+    </w:rPr>
+  </w:style>
 </w:styles>
 </file>
 

</xml_diff>